<commit_message>
ref: adiciona o rascunho anterior no projeto final
</commit_message>
<xml_diff>
--- a/vol-1/Além_do_Código-Livro_principal.docx
+++ b/vol-1/Além_do_Código-Livro_principal.docx
@@ -88,6 +88,26 @@
         <w:lastRenderedPageBreak/>
         <w:t>Nota do Autor</w:t>
       </w:r>
+      <w:r>
+        <w:rPr>
+          <w:rFonts w:ascii="Ink Free" w:eastAsia="Ink Free" w:hAnsi="Ink Free" w:cs="Ink Free"/>
+          <w:b/>
+          <w:bCs/>
+          <w:sz w:val="32"/>
+          <w:szCs w:val="32"/>
+        </w:rPr>
+        <w:t xml:space="preserve">                                              </w:t>
+      </w:r>
+      <w:r>
+        <w:rPr>
+          <w:rFonts w:ascii="Brush Script MT" w:eastAsia="Ink Free" w:hAnsi="Brush Script MT" w:cs="Ink Free"/>
+          <w:b/>
+          <w:bCs/>
+          <w:sz w:val="32"/>
+          <w:szCs w:val="32"/>
+        </w:rPr>
+        <w:t>02</w:t>
+      </w:r>
     </w:p>
     <w:p>
       <w:pPr>
@@ -122,13 +142,7 @@
         <w:rPr>
           <w:rFonts w:ascii="Times New Roman" w:eastAsia="Times New Roman" w:hAnsi="Times New Roman" w:cs="Times New Roman"/>
         </w:rPr>
-        <w:t xml:space="preserve"> é apenas um jovem brasileiro comum, cheio de sonhos, erros, medos e esperanças — exatam</w:t>
-      </w:r>
-      <w:r>
-        <w:rPr>
-          <w:rFonts w:ascii="Times New Roman" w:eastAsia="Times New Roman" w:hAnsi="Times New Roman" w:cs="Times New Roman"/>
-        </w:rPr>
-        <w:t>ente como tantos de nós.</w:t>
+        <w:t xml:space="preserve"> é apenas um jovem brasileiro comum, cheio de sonhos, erros, medos e esperanças — exatamente como tantos de nós.</w:t>
       </w:r>
     </w:p>
     <w:p>
@@ -156,13 +170,7 @@
         <w:rPr>
           <w:rFonts w:ascii="Times New Roman" w:eastAsia="Times New Roman" w:hAnsi="Times New Roman" w:cs="Times New Roman"/>
         </w:rPr>
-        <w:t xml:space="preserve"> acabou sendo, de certa forma, um jeito de</w:t>
-      </w:r>
-      <w:r>
-        <w:rPr>
-          <w:rFonts w:ascii="Times New Roman" w:eastAsia="Times New Roman" w:hAnsi="Times New Roman" w:cs="Times New Roman"/>
-        </w:rPr>
-        <w:t xml:space="preserve"> olhar para as minhas próprias também.</w:t>
+        <w:t xml:space="preserve"> acabou sendo, de certa forma, um jeito de olhar para as minhas próprias também.</w:t>
       </w:r>
     </w:p>
     <w:p>
@@ -176,13 +184,7 @@
         <w:rPr>
           <w:rFonts w:ascii="Times New Roman" w:eastAsia="Times New Roman" w:hAnsi="Times New Roman" w:cs="Times New Roman"/>
         </w:rPr>
-        <w:t>Quero agradecer de coração a você, que está lendo agora, por dar uma chance a esta pequena obra. Meu objetivo é simples: criar algo que valha a pena, me divertir no processo e, quem sabe, melhorar um pouco a cada text</w:t>
-      </w:r>
-      <w:r>
-        <w:rPr>
-          <w:rFonts w:ascii="Times New Roman" w:eastAsia="Times New Roman" w:hAnsi="Times New Roman" w:cs="Times New Roman"/>
-        </w:rPr>
-        <w:t>o que escrevo.</w:t>
+        <w:t>Quero agradecer de coração a você, que está lendo agora, por dar uma chance a esta pequena obra. Meu objetivo é simples: criar algo que valha a pena, me divertir no processo e, quem sabe, melhorar um pouco a cada texto que escrevo.</w:t>
       </w:r>
     </w:p>
     <w:p>
@@ -302,7 +304,15 @@
           <w:szCs w:val="26"/>
         </w:rPr>
         <w:lastRenderedPageBreak/>
-        <w:t>Capítulo 1 – A Faísca na Tela ........................................ 07</w:t>
+        <w:t>Capítulo 1 – A Faísca na Tela ........................................ 0</w:t>
+      </w:r>
+      <w:r>
+        <w:rPr>
+          <w:rFonts w:ascii="Times New Roman" w:eastAsia="Times New Roman" w:hAnsi="Times New Roman" w:cs="Times New Roman"/>
+          <w:sz w:val="26"/>
+          <w:szCs w:val="26"/>
+        </w:rPr>
+        <w:t>4</w:t>
       </w:r>
     </w:p>
     <w:p>
@@ -388,15 +398,7 @@
           <w:sz w:val="26"/>
           <w:szCs w:val="26"/>
         </w:rPr>
-        <w:t>Capítulo 5 – A Rede se Fecha .......</w:t>
-      </w:r>
-      <w:r>
-        <w:rPr>
-          <w:rFonts w:ascii="Times New Roman" w:eastAsia="Times New Roman" w:hAnsi="Times New Roman" w:cs="Times New Roman"/>
-          <w:sz w:val="26"/>
-          <w:szCs w:val="26"/>
-        </w:rPr>
-        <w:t>.................................. 29</w:t>
+        <w:t>Capítulo 5 – A Rede se Fecha ......................................... 29</w:t>
       </w:r>
     </w:p>
     <w:p>
@@ -483,6 +485,278 @@
           <w:szCs w:val="48"/>
         </w:rPr>
       </w:pPr>
+    </w:p>
+    <w:p>
+      <w:pPr>
+        <w:rPr>
+          <w:rFonts w:ascii="Arial" w:eastAsia="Arial" w:hAnsi="Arial" w:cs="Arial"/>
+          <w:b/>
+          <w:bCs/>
+          <w:sz w:val="48"/>
+          <w:szCs w:val="48"/>
+        </w:rPr>
+      </w:pPr>
+    </w:p>
+    <w:p>
+      <w:pPr>
+        <w:rPr>
+          <w:rFonts w:ascii="Arial" w:eastAsia="Arial" w:hAnsi="Arial" w:cs="Arial"/>
+          <w:b/>
+          <w:bCs/>
+          <w:sz w:val="48"/>
+          <w:szCs w:val="48"/>
+        </w:rPr>
+      </w:pPr>
+    </w:p>
+    <w:p>
+      <w:pPr>
+        <w:rPr>
+          <w:rFonts w:ascii="Arial" w:eastAsia="Arial" w:hAnsi="Arial" w:cs="Arial"/>
+          <w:b/>
+          <w:bCs/>
+          <w:sz w:val="48"/>
+          <w:szCs w:val="48"/>
+        </w:rPr>
+      </w:pPr>
+    </w:p>
+    <w:p>
+      <w:pPr>
+        <w:rPr>
+          <w:rFonts w:ascii="Arial" w:eastAsia="Arial" w:hAnsi="Arial" w:cs="Arial"/>
+          <w:b/>
+          <w:bCs/>
+          <w:sz w:val="48"/>
+          <w:szCs w:val="48"/>
+        </w:rPr>
+      </w:pPr>
+    </w:p>
+    <w:p>
+      <w:pPr>
+        <w:rPr>
+          <w:rFonts w:ascii="Arial" w:eastAsia="Arial" w:hAnsi="Arial" w:cs="Arial"/>
+          <w:b/>
+          <w:bCs/>
+          <w:sz w:val="48"/>
+          <w:szCs w:val="48"/>
+        </w:rPr>
+      </w:pPr>
+    </w:p>
+    <w:p>
+      <w:pPr>
+        <w:rPr>
+          <w:rFonts w:ascii="Brush Script MT" w:eastAsia="Arial" w:hAnsi="Brush Script MT" w:cs="Arial"/>
+          <w:b/>
+          <w:bCs/>
+          <w:sz w:val="32"/>
+          <w:szCs w:val="32"/>
+        </w:rPr>
+      </w:pPr>
+      <w:r>
+        <w:rPr>
+          <w:rFonts w:ascii="Georgia" w:eastAsia="Arial" w:hAnsi="Georgia" w:cs="Arial"/>
+          <w:b/>
+          <w:bCs/>
+          <w:sz w:val="40"/>
+          <w:szCs w:val="40"/>
+        </w:rPr>
+        <w:lastRenderedPageBreak/>
+        <w:t>A Faísca na Tela</w:t>
+      </w:r>
+      <w:r>
+        <w:rPr>
+          <w:rFonts w:ascii="Arial" w:eastAsia="Arial" w:hAnsi="Arial" w:cs="Arial"/>
+          <w:b/>
+          <w:bCs/>
+          <w:sz w:val="48"/>
+          <w:szCs w:val="48"/>
+        </w:rPr>
+        <w:t xml:space="preserve">            </w:t>
+      </w:r>
+      <w:r>
+        <w:rPr>
+          <w:rFonts w:ascii="Brush Script MT" w:eastAsia="Arial" w:hAnsi="Brush Script MT" w:cs="Arial"/>
+          <w:b/>
+          <w:bCs/>
+          <w:sz w:val="32"/>
+          <w:szCs w:val="32"/>
+        </w:rPr>
+        <w:t xml:space="preserve">   </w:t>
+      </w:r>
+      <w:r>
+        <w:rPr>
+          <w:rFonts w:ascii="Brush Script MT" w:eastAsia="Arial" w:hAnsi="Brush Script MT" w:cs="Arial"/>
+          <w:b/>
+          <w:bCs/>
+          <w:sz w:val="32"/>
+          <w:szCs w:val="32"/>
+        </w:rPr>
+        <w:t xml:space="preserve">           </w:t>
+      </w:r>
+      <w:r>
+        <w:rPr>
+          <w:rFonts w:ascii="Brush Script MT" w:eastAsia="Arial" w:hAnsi="Brush Script MT" w:cs="Arial"/>
+          <w:b/>
+          <w:bCs/>
+          <w:sz w:val="32"/>
+          <w:szCs w:val="32"/>
+        </w:rPr>
+        <w:t>04</w:t>
+      </w:r>
+    </w:p>
+    <w:p>
+      <w:pPr>
+        <w:pStyle w:val="NormalWeb"/>
+      </w:pPr>
+      <w:r>
+        <w:t xml:space="preserve">Era fim de tarde em Itajubá. O sol já estava quase se pondo quando </w:t>
+      </w:r>
+      <w:proofErr w:type="spellStart"/>
+      <w:r>
+        <w:t>Adriel</w:t>
+      </w:r>
+      <w:proofErr w:type="spellEnd"/>
+      <w:r>
+        <w:t xml:space="preserve"> Carvalho Moura, um garoto de dezesseis anos que cursava o segundo ano do Ensino Médio, estava largado no sofá da sala.</w:t>
+      </w:r>
+    </w:p>
+    <w:p>
+      <w:pPr>
+        <w:pStyle w:val="NormalWeb"/>
+      </w:pPr>
+      <w:r>
+        <w:t>Do lado de fora vinham os barulhos de sempre: carros passando na rua de terra e mães gritando para os filhos entrarem em casa. Dentro de casa, a voz do seu pai, Adailton Carvalho, ecoava alta e nervosa. Ele negociava mais uma vez com o credor pelo telefone, tentando explicar que não tinha como pagar o empréstimo naquele mês.</w:t>
+      </w:r>
+    </w:p>
+    <w:p>
+      <w:pPr>
+        <w:pStyle w:val="NormalWeb"/>
+      </w:pPr>
+      <w:r>
+        <w:t>Sua mãe, Edna Moura, costureira que trabalhava em casa, passou por trás do sofá e sussurrou:</w:t>
+      </w:r>
+    </w:p>
+    <w:p>
+      <w:pPr>
+        <w:pStyle w:val="NormalWeb"/>
+      </w:pPr>
+      <w:r>
+        <w:t xml:space="preserve">— </w:t>
+      </w:r>
+      <w:proofErr w:type="spellStart"/>
+      <w:r>
+        <w:t>Adriel</w:t>
+      </w:r>
+      <w:proofErr w:type="spellEnd"/>
+      <w:r>
+        <w:t>, vai lá lavar a louça. Eu e seu pai estamos resolvendo uns problemas.</w:t>
+      </w:r>
+    </w:p>
+    <w:p>
+      <w:pPr>
+        <w:pStyle w:val="NormalWeb"/>
+      </w:pPr>
+      <w:r>
+        <w:t>— Não enche o saco, mãe — respondeu ele, sem tirar os olhos da televisão.</w:t>
+      </w:r>
+    </w:p>
+    <w:p>
+      <w:pPr>
+        <w:pStyle w:val="NormalWeb"/>
+      </w:pPr>
+      <w:r>
+        <w:t>Edna balançou a cabeça e se afastou em silêncio, indo falar com o marido na cozinha.</w:t>
+      </w:r>
+    </w:p>
+    <w:p>
+      <w:pPr>
+        <w:pStyle w:val="NormalWeb"/>
+      </w:pPr>
+      <w:r>
+        <w:t xml:space="preserve">Alguns minutos depois, uma reportagem chamou a atenção de </w:t>
+      </w:r>
+      <w:proofErr w:type="spellStart"/>
+      <w:r>
+        <w:t>Adriel</w:t>
+      </w:r>
+      <w:proofErr w:type="spellEnd"/>
+      <w:r>
+        <w:t>. Na tela, Mark Zuckerberg aparecia falando em inglês, com legenda em português:</w:t>
+      </w:r>
+    </w:p>
+    <w:p>
+      <w:pPr>
+        <w:pStyle w:val="NormalWeb"/>
+        <w:rPr>
+          <w:lang w:val="en-US"/>
+        </w:rPr>
+      </w:pPr>
+      <w:r>
+        <w:rPr>
+          <w:lang w:val="en-US"/>
+        </w:rPr>
+        <w:t>— If you master the computer, you master the world.</w:t>
+      </w:r>
+    </w:p>
+    <w:p>
+      <w:pPr>
+        <w:pStyle w:val="NormalWeb"/>
+      </w:pPr>
+      <w:r>
+        <w:t>“Se você domina o computador, você domina o mundo.”</w:t>
+      </w:r>
+    </w:p>
+    <w:p>
+      <w:pPr>
+        <w:pStyle w:val="NormalWeb"/>
+      </w:pPr>
+      <w:proofErr w:type="spellStart"/>
+      <w:r>
+        <w:t>Adriel</w:t>
+      </w:r>
+      <w:proofErr w:type="spellEnd"/>
+      <w:r>
+        <w:t xml:space="preserve"> franziu a testa e murmurou baixinho:</w:t>
+      </w:r>
+    </w:p>
+    <w:p>
+      <w:pPr>
+        <w:pStyle w:val="NormalWeb"/>
+      </w:pPr>
+      <w:r>
+        <w:t>— Como será que alguém consegue fazer isso?</w:t>
+      </w:r>
+    </w:p>
+    <w:p>
+      <w:pPr>
+        <w:pStyle w:val="NormalWeb"/>
+        <w:jc w:val="right"/>
+        <w:rPr>
+          <w:rFonts w:ascii="Ink Free" w:hAnsi="Ink Free"/>
+          <w:b/>
+          <w:bCs/>
+          <w:sz w:val="32"/>
+          <w:szCs w:val="32"/>
+        </w:rPr>
+      </w:pPr>
+      <w:r>
+        <w:rPr>
+          <w:rFonts w:ascii="Ink Free" w:hAnsi="Ink Free"/>
+          <w:b/>
+          <w:bCs/>
+          <w:sz w:val="32"/>
+          <w:szCs w:val="32"/>
+        </w:rPr>
+        <w:lastRenderedPageBreak/>
+        <w:t>05</w:t>
+      </w:r>
+    </w:p>
+    <w:p>
+      <w:pPr>
+        <w:pStyle w:val="NormalWeb"/>
+      </w:pPr>
+      <w:r>
+        <w:t>Ele não sabia, mas aquele simples momento seria o começo de tudo.</w:t>
+      </w:r>
     </w:p>
     <w:p>
       <w:pPr>

</xml_diff>

<commit_message>
style: muda estilo da fonte
- estilo de fonte Times New Roman para Georgia
</commit_message>
<xml_diff>
--- a/vol-1/Além_do_Código-Livro_principal.docx
+++ b/vol-1/Além_do_Código-Livro_principal.docx
@@ -42,7 +42,7 @@
                     <pic:cNvPicPr preferRelativeResize="0"/>
                   </pic:nvPicPr>
                   <pic:blipFill>
-                    <a:blip r:embed="rId5"/>
+                    <a:blip r:embed="rId6"/>
                     <a:srcRect/>
                     <a:stretch>
                       <a:fillRect/>
@@ -121,68 +121,40 @@
       <w:pPr>
         <w:spacing w:before="280" w:after="280" w:line="240" w:lineRule="auto"/>
         <w:rPr>
-          <w:rFonts w:ascii="Times New Roman" w:eastAsia="Times New Roman" w:hAnsi="Times New Roman" w:cs="Times New Roman"/>
-        </w:rPr>
-      </w:pPr>
-      <w:r>
-        <w:rPr>
-          <w:rFonts w:ascii="Times New Roman" w:eastAsia="Times New Roman" w:hAnsi="Times New Roman" w:cs="Times New Roman"/>
-        </w:rPr>
-        <w:t xml:space="preserve">Esta história nasceu de uma conversa simples entre três amigos, num fim de uma aula qualquer, enquanto conversávamos sobre vários assuntos, como sempre fazíamos. </w:t>
-      </w:r>
-      <w:proofErr w:type="spellStart"/>
-      <w:r>
-        <w:rPr>
-          <w:rFonts w:ascii="Times New Roman" w:eastAsia="Times New Roman" w:hAnsi="Times New Roman" w:cs="Times New Roman"/>
-        </w:rPr>
-        <w:t>Adriel</w:t>
-      </w:r>
-      <w:proofErr w:type="spellEnd"/>
-      <w:r>
-        <w:rPr>
-          <w:rFonts w:ascii="Times New Roman" w:eastAsia="Times New Roman" w:hAnsi="Times New Roman" w:cs="Times New Roman"/>
-        </w:rPr>
-        <w:t xml:space="preserve"> é apenas um jovem brasileiro comum, cheio de sonhos, erros, medos e esperanças — exatamente como tantos de nós.</w:t>
+          <w:rFonts w:ascii="Georgia" w:eastAsia="Times New Roman" w:hAnsi="Georgia" w:cs="Times New Roman"/>
+        </w:rPr>
+      </w:pPr>
+      <w:r>
+        <w:rPr>
+          <w:rFonts w:ascii="Georgia" w:eastAsia="Times New Roman" w:hAnsi="Georgia" w:cs="Times New Roman"/>
+        </w:rPr>
+        <w:t>Esta história nasceu de uma conversa simples entre três amigos, num fim de uma aula qualquer, enquanto conversávamos sobre vários assuntos, como sempre fazíamos. Adriel é apenas um jovem brasileiro comum, cheio de sonhos, erros, medos e esperanças — exatamente como tantos de nós.</w:t>
       </w:r>
     </w:p>
     <w:p>
       <w:pPr>
         <w:spacing w:before="280" w:after="280" w:line="240" w:lineRule="auto"/>
         <w:rPr>
-          <w:rFonts w:ascii="Times New Roman" w:eastAsia="Times New Roman" w:hAnsi="Times New Roman" w:cs="Times New Roman"/>
-        </w:rPr>
-      </w:pPr>
-      <w:r>
-        <w:rPr>
-          <w:rFonts w:ascii="Times New Roman" w:eastAsia="Times New Roman" w:hAnsi="Times New Roman" w:cs="Times New Roman"/>
-        </w:rPr>
-        <w:t xml:space="preserve">Ao longo da jornada dele, surgiram muitas controvérsias internas, dúvidas dolorosas e conflitos que me fizeram parar várias vezes para refletir. Escrever sobre as escolhas erradas de </w:t>
-      </w:r>
-      <w:proofErr w:type="spellStart"/>
-      <w:r>
-        <w:rPr>
-          <w:rFonts w:ascii="Times New Roman" w:eastAsia="Times New Roman" w:hAnsi="Times New Roman" w:cs="Times New Roman"/>
-        </w:rPr>
-        <w:t>Adriel</w:t>
-      </w:r>
-      <w:proofErr w:type="spellEnd"/>
-      <w:r>
-        <w:rPr>
-          <w:rFonts w:ascii="Times New Roman" w:eastAsia="Times New Roman" w:hAnsi="Times New Roman" w:cs="Times New Roman"/>
-        </w:rPr>
-        <w:t xml:space="preserve"> acabou sendo, de certa forma, um jeito de olhar para as minhas próprias também.</w:t>
+          <w:rFonts w:ascii="Georgia" w:eastAsia="Times New Roman" w:hAnsi="Georgia" w:cs="Times New Roman"/>
+        </w:rPr>
+      </w:pPr>
+      <w:r>
+        <w:rPr>
+          <w:rFonts w:ascii="Georgia" w:eastAsia="Times New Roman" w:hAnsi="Georgia" w:cs="Times New Roman"/>
+        </w:rPr>
+        <w:t>Ao longo da jornada dele, surgiram muitas controvérsias internas, dúvidas dolorosas e conflitos que me fizeram parar várias vezes para refletir. Escrever sobre as escolhas erradas de Adriel acabou sendo, de certa forma, um jeito de olhar para as minhas próprias também.</w:t>
       </w:r>
     </w:p>
     <w:p>
       <w:pPr>
         <w:spacing w:before="280" w:after="280" w:line="240" w:lineRule="auto"/>
         <w:rPr>
-          <w:rFonts w:ascii="Times New Roman" w:eastAsia="Times New Roman" w:hAnsi="Times New Roman" w:cs="Times New Roman"/>
-        </w:rPr>
-      </w:pPr>
-      <w:r>
-        <w:rPr>
-          <w:rFonts w:ascii="Times New Roman" w:eastAsia="Times New Roman" w:hAnsi="Times New Roman" w:cs="Times New Roman"/>
+          <w:rFonts w:ascii="Georgia" w:eastAsia="Times New Roman" w:hAnsi="Georgia" w:cs="Times New Roman"/>
+        </w:rPr>
+      </w:pPr>
+      <w:r>
+        <w:rPr>
+          <w:rFonts w:ascii="Georgia" w:eastAsia="Times New Roman" w:hAnsi="Georgia" w:cs="Times New Roman"/>
         </w:rPr>
         <w:t>Quero agradecer de coração a você, que está lendo agora, por dar uma chance a esta pequena obra. Meu objetivo é simples: criar algo que valha a pena, me divertir no processo e, quem sabe, melhorar um pouco a cada texto que escrevo.</w:t>
       </w:r>
@@ -191,37 +163,15 @@
       <w:pPr>
         <w:spacing w:before="280" w:after="280" w:line="240" w:lineRule="auto"/>
         <w:rPr>
-          <w:rFonts w:ascii="Times New Roman" w:eastAsia="Times New Roman" w:hAnsi="Times New Roman" w:cs="Times New Roman"/>
-        </w:rPr>
-      </w:pPr>
-      <w:r>
-        <w:rPr>
-          <w:rFonts w:ascii="Times New Roman" w:eastAsia="Times New Roman" w:hAnsi="Times New Roman" w:cs="Times New Roman"/>
-        </w:rPr>
-        <w:t xml:space="preserve">Deixando minhas palavras de lado… boa leitura! Que você se permita embarcar nessa jornada junto com o </w:t>
-      </w:r>
-      <w:proofErr w:type="spellStart"/>
-      <w:r>
-        <w:rPr>
-          <w:rFonts w:ascii="Times New Roman" w:eastAsia="Times New Roman" w:hAnsi="Times New Roman" w:cs="Times New Roman"/>
-        </w:rPr>
-        <w:t>Adriel</w:t>
-      </w:r>
-      <w:proofErr w:type="spellEnd"/>
-      <w:r>
-        <w:rPr>
-          <w:rFonts w:ascii="Times New Roman" w:eastAsia="Times New Roman" w:hAnsi="Times New Roman" w:cs="Times New Roman"/>
-        </w:rPr>
-        <w:t>, com o coração aberto.</w:t>
-      </w:r>
-    </w:p>
-    <w:p>
-      <w:pPr>
-        <w:spacing w:before="280" w:after="280" w:line="240" w:lineRule="auto"/>
-        <w:rPr>
-          <w:rFonts w:ascii="Times New Roman" w:eastAsia="Times New Roman" w:hAnsi="Times New Roman" w:cs="Times New Roman"/>
-        </w:rPr>
-      </w:pPr>
+          <w:rFonts w:ascii="Georgia" w:eastAsia="Times New Roman" w:hAnsi="Georgia" w:cs="Times New Roman"/>
+        </w:rPr>
+      </w:pPr>
+      <w:r>
+        <w:rPr>
+          <w:rFonts w:ascii="Georgia" w:eastAsia="Times New Roman" w:hAnsi="Georgia" w:cs="Times New Roman"/>
+        </w:rPr>
+        <w:t>Deixando minhas palavras de lado… boa leitura! Que você se permita embarcar nessa jornada junto com o Adriel, com o coração aberto.</w:t>
+      </w:r>
     </w:p>
     <w:p>
       <w:pPr>
@@ -292,25 +242,19 @@
     <w:p>
       <w:pPr>
         <w:rPr>
-          <w:rFonts w:ascii="Times New Roman" w:eastAsia="Times New Roman" w:hAnsi="Times New Roman" w:cs="Times New Roman"/>
-          <w:sz w:val="26"/>
-          <w:szCs w:val="26"/>
-        </w:rPr>
-      </w:pPr>
-      <w:r>
-        <w:rPr>
-          <w:rFonts w:ascii="Times New Roman" w:eastAsia="Times New Roman" w:hAnsi="Times New Roman" w:cs="Times New Roman"/>
-          <w:sz w:val="26"/>
-          <w:szCs w:val="26"/>
+          <w:rFonts w:ascii="Georgia" w:eastAsia="Times New Roman" w:hAnsi="Georgia" w:cs="Times New Roman"/>
+        </w:rPr>
+      </w:pPr>
+      <w:r>
+        <w:rPr>
+          <w:rFonts w:ascii="Georgia" w:eastAsia="Times New Roman" w:hAnsi="Georgia" w:cs="Times New Roman"/>
         </w:rPr>
         <w:lastRenderedPageBreak/>
         <w:t>Capítulo 1 – A Faísca na Tela ........................................ 0</w:t>
       </w:r>
       <w:r>
         <w:rPr>
-          <w:rFonts w:ascii="Times New Roman" w:eastAsia="Times New Roman" w:hAnsi="Times New Roman" w:cs="Times New Roman"/>
-          <w:sz w:val="26"/>
-          <w:szCs w:val="26"/>
+          <w:rFonts w:ascii="Georgia" w:eastAsia="Times New Roman" w:hAnsi="Georgia" w:cs="Times New Roman"/>
         </w:rPr>
         <w:t>4</w:t>
       </w:r>
@@ -318,16 +262,12 @@
     <w:p>
       <w:pPr>
         <w:rPr>
-          <w:rFonts w:ascii="Times New Roman" w:eastAsia="Times New Roman" w:hAnsi="Times New Roman" w:cs="Times New Roman"/>
-          <w:sz w:val="26"/>
-          <w:szCs w:val="26"/>
-        </w:rPr>
-      </w:pPr>
-      <w:r>
-        <w:rPr>
-          <w:rFonts w:ascii="Times New Roman" w:eastAsia="Times New Roman" w:hAnsi="Times New Roman" w:cs="Times New Roman"/>
-          <w:sz w:val="26"/>
-          <w:szCs w:val="26"/>
+          <w:rFonts w:ascii="Georgia" w:eastAsia="Times New Roman" w:hAnsi="Georgia" w:cs="Times New Roman"/>
+        </w:rPr>
+      </w:pPr>
+      <w:r>
+        <w:rPr>
+          <w:rFonts w:ascii="Georgia" w:eastAsia="Times New Roman" w:hAnsi="Georgia" w:cs="Times New Roman"/>
         </w:rPr>
         <w:t>Capítulo 2 – O Preço de um Sonho .................................... 12</w:t>
       </w:r>
@@ -335,16 +275,12 @@
     <w:p>
       <w:pPr>
         <w:rPr>
-          <w:rFonts w:ascii="Times New Roman" w:eastAsia="Times New Roman" w:hAnsi="Times New Roman" w:cs="Times New Roman"/>
-          <w:sz w:val="26"/>
-          <w:szCs w:val="26"/>
-        </w:rPr>
-      </w:pPr>
-      <w:r>
-        <w:rPr>
-          <w:rFonts w:ascii="Times New Roman" w:eastAsia="Times New Roman" w:hAnsi="Times New Roman" w:cs="Times New Roman"/>
-          <w:sz w:val="26"/>
-          <w:szCs w:val="26"/>
+          <w:rFonts w:ascii="Georgia" w:eastAsia="Times New Roman" w:hAnsi="Georgia" w:cs="Times New Roman"/>
+        </w:rPr>
+      </w:pPr>
+      <w:r>
+        <w:rPr>
+          <w:rFonts w:ascii="Georgia" w:eastAsia="Times New Roman" w:hAnsi="Georgia" w:cs="Times New Roman"/>
         </w:rPr>
         <w:t>Capítulo 3 – As Primeiras Linhas ..................................... 17</w:t>
       </w:r>
@@ -352,51 +288,25 @@
     <w:p>
       <w:pPr>
         <w:rPr>
-          <w:rFonts w:ascii="Times New Roman" w:eastAsia="Times New Roman" w:hAnsi="Times New Roman" w:cs="Times New Roman"/>
-          <w:sz w:val="26"/>
-          <w:szCs w:val="26"/>
-        </w:rPr>
-      </w:pPr>
-      <w:r>
-        <w:rPr>
-          <w:rFonts w:ascii="Times New Roman" w:eastAsia="Times New Roman" w:hAnsi="Times New Roman" w:cs="Times New Roman"/>
-          <w:sz w:val="26"/>
-          <w:szCs w:val="26"/>
-        </w:rPr>
-        <w:t xml:space="preserve">Capítulo 4 – A Linha que </w:t>
-      </w:r>
-      <w:proofErr w:type="gramStart"/>
-      <w:r>
-        <w:rPr>
-          <w:rFonts w:ascii="Times New Roman" w:eastAsia="Times New Roman" w:hAnsi="Times New Roman" w:cs="Times New Roman"/>
-          <w:sz w:val="26"/>
-          <w:szCs w:val="26"/>
-        </w:rPr>
-        <w:t>se Rompe</w:t>
-      </w:r>
-      <w:proofErr w:type="gramEnd"/>
-      <w:r>
-        <w:rPr>
-          <w:rFonts w:ascii="Times New Roman" w:eastAsia="Times New Roman" w:hAnsi="Times New Roman" w:cs="Times New Roman"/>
-          <w:sz w:val="26"/>
-          <w:szCs w:val="26"/>
-        </w:rPr>
-        <w:t xml:space="preserve"> ................................... 23</w:t>
-      </w:r>
-    </w:p>
-    <w:p>
-      <w:pPr>
-        <w:rPr>
-          <w:rFonts w:ascii="Times New Roman" w:eastAsia="Times New Roman" w:hAnsi="Times New Roman" w:cs="Times New Roman"/>
-          <w:sz w:val="26"/>
-          <w:szCs w:val="26"/>
-        </w:rPr>
-      </w:pPr>
-      <w:r>
-        <w:rPr>
-          <w:rFonts w:ascii="Times New Roman" w:eastAsia="Times New Roman" w:hAnsi="Times New Roman" w:cs="Times New Roman"/>
-          <w:sz w:val="26"/>
-          <w:szCs w:val="26"/>
+          <w:rFonts w:ascii="Georgia" w:eastAsia="Times New Roman" w:hAnsi="Georgia" w:cs="Times New Roman"/>
+        </w:rPr>
+      </w:pPr>
+      <w:r>
+        <w:rPr>
+          <w:rFonts w:ascii="Georgia" w:eastAsia="Times New Roman" w:hAnsi="Georgia" w:cs="Times New Roman"/>
+        </w:rPr>
+        <w:t>Capítulo 4 – A Linha que se Rompe ................................... 23</w:t>
+      </w:r>
+    </w:p>
+    <w:p>
+      <w:pPr>
+        <w:rPr>
+          <w:rFonts w:ascii="Georgia" w:eastAsia="Times New Roman" w:hAnsi="Georgia" w:cs="Times New Roman"/>
+        </w:rPr>
+      </w:pPr>
+      <w:r>
+        <w:rPr>
+          <w:rFonts w:ascii="Georgia" w:eastAsia="Times New Roman" w:hAnsi="Georgia" w:cs="Times New Roman"/>
         </w:rPr>
         <w:t>Capítulo 5 – A Rede se Fecha ......................................... 29</w:t>
       </w:r>
@@ -404,16 +314,12 @@
     <w:p>
       <w:pPr>
         <w:rPr>
-          <w:rFonts w:ascii="Times New Roman" w:eastAsia="Times New Roman" w:hAnsi="Times New Roman" w:cs="Times New Roman"/>
-          <w:sz w:val="26"/>
-          <w:szCs w:val="26"/>
-        </w:rPr>
-      </w:pPr>
-      <w:r>
-        <w:rPr>
-          <w:rFonts w:ascii="Times New Roman" w:eastAsia="Times New Roman" w:hAnsi="Times New Roman" w:cs="Times New Roman"/>
-          <w:sz w:val="26"/>
-          <w:szCs w:val="26"/>
+          <w:rFonts w:ascii="Georgia" w:eastAsia="Times New Roman" w:hAnsi="Georgia" w:cs="Times New Roman"/>
+        </w:rPr>
+      </w:pPr>
+      <w:r>
+        <w:rPr>
+          <w:rFonts w:ascii="Georgia" w:eastAsia="Times New Roman" w:hAnsi="Georgia" w:cs="Times New Roman"/>
         </w:rPr>
         <w:t>Capítulo 6 – O Peso do Código ........................................ 35</w:t>
       </w:r>
@@ -421,16 +327,12 @@
     <w:p>
       <w:pPr>
         <w:rPr>
-          <w:rFonts w:ascii="Times New Roman" w:eastAsia="Times New Roman" w:hAnsi="Times New Roman" w:cs="Times New Roman"/>
-          <w:sz w:val="26"/>
-          <w:szCs w:val="26"/>
-        </w:rPr>
-      </w:pPr>
-      <w:r>
-        <w:rPr>
-          <w:rFonts w:ascii="Times New Roman" w:eastAsia="Times New Roman" w:hAnsi="Times New Roman" w:cs="Times New Roman"/>
-          <w:sz w:val="26"/>
-          <w:szCs w:val="26"/>
+          <w:rFonts w:ascii="Georgia" w:eastAsia="Times New Roman" w:hAnsi="Georgia" w:cs="Times New Roman"/>
+        </w:rPr>
+      </w:pPr>
+      <w:r>
+        <w:rPr>
+          <w:rFonts w:ascii="Georgia" w:eastAsia="Times New Roman" w:hAnsi="Georgia" w:cs="Times New Roman"/>
         </w:rPr>
         <w:t>Capítulo 7 – A Brecha da Graça ....................................... 41</w:t>
       </w:r>
@@ -439,16 +341,12 @@
       <w:pPr>
         <w:spacing w:before="240" w:after="240"/>
         <w:rPr>
-          <w:rFonts w:ascii="Times New Roman" w:eastAsia="Times New Roman" w:hAnsi="Times New Roman" w:cs="Times New Roman"/>
-          <w:sz w:val="26"/>
-          <w:szCs w:val="26"/>
-        </w:rPr>
-      </w:pPr>
-      <w:r>
-        <w:rPr>
-          <w:rFonts w:ascii="Times New Roman" w:eastAsia="Times New Roman" w:hAnsi="Times New Roman" w:cs="Times New Roman"/>
-          <w:sz w:val="26"/>
-          <w:szCs w:val="26"/>
+          <w:rFonts w:ascii="Georgia" w:eastAsia="Times New Roman" w:hAnsi="Georgia" w:cs="Times New Roman"/>
+        </w:rPr>
+      </w:pPr>
+      <w:r>
+        <w:rPr>
+          <w:rFonts w:ascii="Georgia" w:eastAsia="Times New Roman" w:hAnsi="Georgia" w:cs="Times New Roman"/>
         </w:rPr>
         <w:t>Capítulo 8 – Linhas Reescritas ....................................... 47</w:t>
       </w:r>
@@ -606,92 +504,144 @@
     <w:p>
       <w:pPr>
         <w:pStyle w:val="NormalWeb"/>
-      </w:pPr>
-      <w:r>
-        <w:t xml:space="preserve">Era fim de tarde em Itajubá. O sol já estava quase se pondo quando </w:t>
-      </w:r>
-      <w:proofErr w:type="spellStart"/>
-      <w:r>
-        <w:t>Adriel</w:t>
-      </w:r>
-      <w:proofErr w:type="spellEnd"/>
-      <w:r>
-        <w:t xml:space="preserve"> Carvalho Moura, um garoto de dezesseis anos que cursava o segundo ano do Ensino Médio, estava largado no sofá da sala.</w:t>
+        <w:rPr>
+          <w:rFonts w:ascii="Georgia" w:hAnsi="Georgia"/>
+          <w:sz w:val="22"/>
+          <w:szCs w:val="22"/>
+        </w:rPr>
+      </w:pPr>
+      <w:r>
+        <w:rPr>
+          <w:rFonts w:ascii="Georgia" w:hAnsi="Georgia"/>
+          <w:sz w:val="22"/>
+          <w:szCs w:val="22"/>
+        </w:rPr>
+        <w:t>Era fim de tarde em Itajubá. O sol já estava quase se pondo quando Adriel Carvalho Moura, um garoto de dezesseis anos que cursava o segundo ano do Ensino Médio, estava largado no sofá da sala.</w:t>
       </w:r>
     </w:p>
     <w:p>
       <w:pPr>
         <w:pStyle w:val="NormalWeb"/>
-      </w:pPr>
-      <w:r>
+        <w:rPr>
+          <w:rFonts w:ascii="Georgia" w:hAnsi="Georgia"/>
+          <w:sz w:val="22"/>
+          <w:szCs w:val="22"/>
+        </w:rPr>
+      </w:pPr>
+      <w:r>
+        <w:rPr>
+          <w:rFonts w:ascii="Georgia" w:hAnsi="Georgia"/>
+          <w:sz w:val="22"/>
+          <w:szCs w:val="22"/>
+        </w:rPr>
         <w:t>Do lado de fora vinham os barulhos de sempre: carros passando na rua de terra e mães gritando para os filhos entrarem em casa. Dentro de casa, a voz do seu pai, Adailton Carvalho, ecoava alta e nervosa. Ele negociava mais uma vez com o credor pelo telefone, tentando explicar que não tinha como pagar o empréstimo naquele mês.</w:t>
       </w:r>
     </w:p>
     <w:p>
       <w:pPr>
         <w:pStyle w:val="NormalWeb"/>
-      </w:pPr>
-      <w:r>
+        <w:rPr>
+          <w:rFonts w:ascii="Georgia" w:hAnsi="Georgia"/>
+          <w:sz w:val="22"/>
+          <w:szCs w:val="22"/>
+        </w:rPr>
+      </w:pPr>
+      <w:r>
+        <w:rPr>
+          <w:rFonts w:ascii="Georgia" w:hAnsi="Georgia"/>
+          <w:sz w:val="22"/>
+          <w:szCs w:val="22"/>
+        </w:rPr>
         <w:t>Sua mãe, Edna Moura, costureira que trabalhava em casa, passou por trás do sofá e sussurrou:</w:t>
       </w:r>
     </w:p>
     <w:p>
       <w:pPr>
         <w:pStyle w:val="NormalWeb"/>
-      </w:pPr>
-      <w:r>
-        <w:t xml:space="preserve">— </w:t>
-      </w:r>
-      <w:proofErr w:type="spellStart"/>
-      <w:r>
-        <w:t>Adriel</w:t>
-      </w:r>
-      <w:proofErr w:type="spellEnd"/>
-      <w:r>
-        <w:t>, vai lá lavar a louça. Eu e seu pai estamos resolvendo uns problemas.</w:t>
+        <w:rPr>
+          <w:rFonts w:ascii="Georgia" w:hAnsi="Georgia"/>
+          <w:sz w:val="22"/>
+          <w:szCs w:val="22"/>
+        </w:rPr>
+      </w:pPr>
+      <w:r>
+        <w:rPr>
+          <w:rFonts w:ascii="Georgia" w:hAnsi="Georgia"/>
+          <w:sz w:val="22"/>
+          <w:szCs w:val="22"/>
+        </w:rPr>
+        <w:t>— Adriel, vai lá lavar a louça. Eu e seu pai estamos resolvendo uns problemas.</w:t>
       </w:r>
     </w:p>
     <w:p>
       <w:pPr>
         <w:pStyle w:val="NormalWeb"/>
-      </w:pPr>
-      <w:r>
+        <w:rPr>
+          <w:rFonts w:ascii="Georgia" w:hAnsi="Georgia"/>
+          <w:sz w:val="22"/>
+          <w:szCs w:val="22"/>
+        </w:rPr>
+      </w:pPr>
+      <w:r>
+        <w:rPr>
+          <w:rFonts w:ascii="Georgia" w:hAnsi="Georgia"/>
+          <w:sz w:val="22"/>
+          <w:szCs w:val="22"/>
+        </w:rPr>
         <w:t>— Não enche o saco, mãe — respondeu ele, sem tirar os olhos da televisão.</w:t>
       </w:r>
     </w:p>
     <w:p>
       <w:pPr>
         <w:pStyle w:val="NormalWeb"/>
-      </w:pPr>
-      <w:r>
+        <w:rPr>
+          <w:rFonts w:ascii="Georgia" w:hAnsi="Georgia"/>
+          <w:sz w:val="22"/>
+          <w:szCs w:val="22"/>
+        </w:rPr>
+      </w:pPr>
+      <w:r>
+        <w:rPr>
+          <w:rFonts w:ascii="Georgia" w:hAnsi="Georgia"/>
+          <w:sz w:val="22"/>
+          <w:szCs w:val="22"/>
+        </w:rPr>
         <w:t>Edna balançou a cabeça e se afastou em silêncio, indo falar com o marido na cozinha.</w:t>
       </w:r>
     </w:p>
     <w:p>
       <w:pPr>
         <w:pStyle w:val="NormalWeb"/>
-      </w:pPr>
-      <w:r>
-        <w:t xml:space="preserve">Alguns minutos depois, uma reportagem chamou a atenção de </w:t>
-      </w:r>
-      <w:proofErr w:type="spellStart"/>
-      <w:r>
-        <w:t>Adriel</w:t>
-      </w:r>
-      <w:proofErr w:type="spellEnd"/>
-      <w:r>
-        <w:t>. Na tela, Mark Zuckerberg aparecia falando em inglês, com legenda em português:</w:t>
+        <w:rPr>
+          <w:rFonts w:ascii="Georgia" w:hAnsi="Georgia"/>
+          <w:sz w:val="22"/>
+          <w:szCs w:val="22"/>
+        </w:rPr>
+      </w:pPr>
+      <w:r>
+        <w:rPr>
+          <w:rFonts w:ascii="Georgia" w:hAnsi="Georgia"/>
+          <w:sz w:val="22"/>
+          <w:szCs w:val="22"/>
+        </w:rPr>
+        <w:t>Alguns minutos depois, uma reportagem chamou a atenção de Adriel. Na tela, Mark Zuckerberg aparecia falando em inglês, com legenda em português:</w:t>
       </w:r>
     </w:p>
     <w:p>
       <w:pPr>
         <w:pStyle w:val="NormalWeb"/>
         <w:rPr>
+          <w:rFonts w:ascii="Georgia" w:hAnsi="Georgia"/>
+          <w:sz w:val="22"/>
+          <w:szCs w:val="22"/>
           <w:lang w:val="en-US"/>
         </w:rPr>
       </w:pPr>
       <w:r>
         <w:rPr>
+          <w:rFonts w:ascii="Georgia" w:hAnsi="Georgia"/>
+          <w:sz w:val="22"/>
+          <w:szCs w:val="22"/>
           <w:lang w:val="en-US"/>
         </w:rPr>
         <w:t>— If you master the computer, you master the world.</w:t>
@@ -700,29 +650,54 @@
     <w:p>
       <w:pPr>
         <w:pStyle w:val="NormalWeb"/>
-      </w:pPr>
-      <w:r>
+        <w:rPr>
+          <w:rFonts w:ascii="Georgia" w:hAnsi="Georgia"/>
+          <w:sz w:val="22"/>
+          <w:szCs w:val="22"/>
+        </w:rPr>
+      </w:pPr>
+      <w:r>
+        <w:rPr>
+          <w:rFonts w:ascii="Georgia" w:hAnsi="Georgia"/>
+          <w:sz w:val="22"/>
+          <w:szCs w:val="22"/>
+        </w:rPr>
         <w:t>“Se você domina o computador, você domina o mundo.”</w:t>
       </w:r>
     </w:p>
     <w:p>
       <w:pPr>
         <w:pStyle w:val="NormalWeb"/>
-      </w:pPr>
-      <w:proofErr w:type="spellStart"/>
-      <w:r>
-        <w:t>Adriel</w:t>
-      </w:r>
-      <w:proofErr w:type="spellEnd"/>
-      <w:r>
-        <w:t xml:space="preserve"> franziu a testa e murmurou baixinho:</w:t>
+        <w:rPr>
+          <w:rFonts w:ascii="Georgia" w:hAnsi="Georgia"/>
+          <w:sz w:val="22"/>
+          <w:szCs w:val="22"/>
+        </w:rPr>
+      </w:pPr>
+      <w:r>
+        <w:rPr>
+          <w:rFonts w:ascii="Georgia" w:hAnsi="Georgia"/>
+          <w:sz w:val="22"/>
+          <w:szCs w:val="22"/>
+        </w:rPr>
+        <w:t>Adriel franziu a testa e murmurou baixinho:</w:t>
       </w:r>
     </w:p>
     <w:p>
       <w:pPr>
         <w:pStyle w:val="NormalWeb"/>
-      </w:pPr>
-      <w:r>
+        <w:rPr>
+          <w:rFonts w:ascii="Georgia" w:hAnsi="Georgia"/>
+          <w:sz w:val="22"/>
+          <w:szCs w:val="22"/>
+        </w:rPr>
+      </w:pPr>
+      <w:r>
+        <w:rPr>
+          <w:rFonts w:ascii="Georgia" w:hAnsi="Georgia"/>
+          <w:sz w:val="22"/>
+          <w:szCs w:val="22"/>
+        </w:rPr>
         <w:t>— Como será que alguém consegue fazer isso?</w:t>
       </w:r>
     </w:p>
@@ -753,9 +728,49 @@
     <w:p>
       <w:pPr>
         <w:pStyle w:val="NormalWeb"/>
-      </w:pPr>
-      <w:r>
+        <w:rPr>
+          <w:rFonts w:ascii="Georgia" w:hAnsi="Georgia"/>
+          <w:sz w:val="22"/>
+          <w:szCs w:val="22"/>
+        </w:rPr>
+      </w:pPr>
+      <w:r>
+        <w:rPr>
+          <w:rFonts w:ascii="Georgia" w:hAnsi="Georgia"/>
+          <w:sz w:val="22"/>
+          <w:szCs w:val="22"/>
+        </w:rPr>
         <w:t>Ele não sabia, mas aquele simples momento seria o começo de tudo.</w:t>
+      </w:r>
+    </w:p>
+    <w:p>
+      <w:pPr>
+        <w:pStyle w:val="NormalWeb"/>
+        <w:numPr>
+          <w:ilvl w:val="0"/>
+          <w:numId w:val="3"/>
+        </w:numPr>
+        <w:rPr>
+          <w:rFonts w:ascii="Liberation Mono" w:hAnsi="Liberation Mono" w:cs="Liberation Mono"/>
+          <w:sz w:val="28"/>
+          <w:szCs w:val="28"/>
+        </w:rPr>
+      </w:pPr>
+      <w:r>
+        <w:rPr>
+          <w:rFonts w:ascii="Liberation Mono" w:hAnsi="Liberation Mono" w:cs="Liberation Mono"/>
+          <w:sz w:val="48"/>
+          <w:szCs w:val="48"/>
+        </w:rPr>
+        <w:t>A</w:t>
+      </w:r>
+      <w:r>
+        <w:rPr>
+          <w:rFonts w:ascii="Liberation Mono" w:hAnsi="Liberation Mono" w:cs="Liberation Mono"/>
+          <w:sz w:val="28"/>
+          <w:szCs w:val="28"/>
+        </w:rPr>
+        <w:t xml:space="preserve"> chama</w:t>
       </w:r>
     </w:p>
     <w:p>
@@ -776,6 +791,359 @@
     </w:sectPr>
   </w:body>
 </w:document>
+</file>
+
+<file path=word/numbering.xml><?xml version="1.0" encoding="utf-8"?>
+<w:numbering xmlns:wpc="http://schemas.microsoft.com/office/word/2010/wordprocessingCanvas" xmlns:cx="http://schemas.microsoft.com/office/drawing/2014/chartex" xmlns:cx1="http://schemas.microsoft.com/office/drawing/2015/9/8/chartex" xmlns:cx2="http://schemas.microsoft.com/office/drawing/2015/10/21/chartex" xmlns:cx3="http://schemas.microsoft.com/office/drawing/2016/5/9/chartex" xmlns:cx4="http://schemas.microsoft.com/office/drawing/2016/5/10/chartex" xmlns:cx5="http://schemas.microsoft.com/office/drawing/2016/5/11/chartex" xmlns:cx6="http://schemas.microsoft.com/office/drawing/2016/5/12/chartex" xmlns:cx7="http://schemas.microsoft.com/office/drawing/2016/5/13/chartex" xmlns:cx8="http://schemas.microsoft.com/office/drawing/2016/5/14/chartex" xmlns:mc="http://schemas.openxmlformats.org/markup-compatibility/2006" xmlns:aink="http://schemas.microsoft.com/office/drawing/2016/ink" xmlns:am3d="http://schemas.microsoft.com/office/drawing/2017/model3d" xmlns:o="urn:schemas-microsoft-com:office:office" xmlns:r="http://schemas.openxmlformats.org/officeDocument/2006/relationships" xmlns:m="http://schemas.openxmlformats.org/officeDocument/2006/math" xmlns:v="urn:schemas-microsoft-com:vml" xmlns:wp14="http://schemas.microsoft.com/office/word/2010/wordprocessingDrawing" xmlns:wp="http://schemas.openxmlformats.org/drawingml/2006/wordprocessingDrawing" xmlns:w10="urn:schemas-microsoft-com:office:word" xmlns:w="http://schemas.openxmlformats.org/wordprocessingml/2006/main" xmlns:w14="http://schemas.microsoft.com/office/word/2010/wordml" xmlns:w15="http://schemas.microsoft.com/office/word/2012/wordml" xmlns:w16cex="http://schemas.microsoft.com/office/word/2018/wordml/cex" xmlns:w16cid="http://schemas.microsoft.com/office/word/2016/wordml/cid" xmlns:w16="http://schemas.microsoft.com/office/word/2018/wordml" xmlns:w16sdtdh="http://schemas.microsoft.com/office/word/2020/wordml/sdtdatahash" xmlns:w16se="http://schemas.microsoft.com/office/word/2015/wordml/symex" xmlns:wpg="http://schemas.microsoft.com/office/word/2010/wordprocessingGroup" xmlns:wpi="http://schemas.microsoft.com/office/word/2010/wordprocessingInk" xmlns:wne="http://schemas.microsoft.com/office/word/2006/wordml" xmlns:wps="http://schemas.microsoft.com/office/word/2010/wordprocessingShape" mc:Ignorable="w14 w15 w16se w16cid w16 w16cex w16sdtdh wp14">
+  <w:abstractNum w:abstractNumId="0" w15:restartNumberingAfterBreak="0">
+    <w:nsid w:val="2BB16417"/>
+    <w:multiLevelType w:val="hybridMultilevel"/>
+    <w:tmpl w:val="2458868C"/>
+    <w:lvl w:ilvl="0" w:tplc="04160001">
+      <w:start w:val="1"/>
+      <w:numFmt w:val="bullet"/>
+      <w:lvlText w:val=""/>
+      <w:lvlJc w:val="left"/>
+      <w:pPr>
+        <w:ind w:left="720" w:hanging="360"/>
+      </w:pPr>
+      <w:rPr>
+        <w:rFonts w:ascii="Symbol" w:hAnsi="Symbol" w:hint="default"/>
+      </w:rPr>
+    </w:lvl>
+    <w:lvl w:ilvl="1" w:tplc="04160003" w:tentative="1">
+      <w:start w:val="1"/>
+      <w:numFmt w:val="bullet"/>
+      <w:lvlText w:val="o"/>
+      <w:lvlJc w:val="left"/>
+      <w:pPr>
+        <w:ind w:left="1440" w:hanging="360"/>
+      </w:pPr>
+      <w:rPr>
+        <w:rFonts w:ascii="Courier New" w:hAnsi="Courier New" w:cs="Courier New" w:hint="default"/>
+      </w:rPr>
+    </w:lvl>
+    <w:lvl w:ilvl="2" w:tplc="04160005" w:tentative="1">
+      <w:start w:val="1"/>
+      <w:numFmt w:val="bullet"/>
+      <w:lvlText w:val=""/>
+      <w:lvlJc w:val="left"/>
+      <w:pPr>
+        <w:ind w:left="2160" w:hanging="360"/>
+      </w:pPr>
+      <w:rPr>
+        <w:rFonts w:ascii="Wingdings" w:hAnsi="Wingdings" w:hint="default"/>
+      </w:rPr>
+    </w:lvl>
+    <w:lvl w:ilvl="3" w:tplc="04160001" w:tentative="1">
+      <w:start w:val="1"/>
+      <w:numFmt w:val="bullet"/>
+      <w:lvlText w:val=""/>
+      <w:lvlJc w:val="left"/>
+      <w:pPr>
+        <w:ind w:left="2880" w:hanging="360"/>
+      </w:pPr>
+      <w:rPr>
+        <w:rFonts w:ascii="Symbol" w:hAnsi="Symbol" w:hint="default"/>
+      </w:rPr>
+    </w:lvl>
+    <w:lvl w:ilvl="4" w:tplc="04160003" w:tentative="1">
+      <w:start w:val="1"/>
+      <w:numFmt w:val="bullet"/>
+      <w:lvlText w:val="o"/>
+      <w:lvlJc w:val="left"/>
+      <w:pPr>
+        <w:ind w:left="3600" w:hanging="360"/>
+      </w:pPr>
+      <w:rPr>
+        <w:rFonts w:ascii="Courier New" w:hAnsi="Courier New" w:cs="Courier New" w:hint="default"/>
+      </w:rPr>
+    </w:lvl>
+    <w:lvl w:ilvl="5" w:tplc="04160005" w:tentative="1">
+      <w:start w:val="1"/>
+      <w:numFmt w:val="bullet"/>
+      <w:lvlText w:val=""/>
+      <w:lvlJc w:val="left"/>
+      <w:pPr>
+        <w:ind w:left="4320" w:hanging="360"/>
+      </w:pPr>
+      <w:rPr>
+        <w:rFonts w:ascii="Wingdings" w:hAnsi="Wingdings" w:hint="default"/>
+      </w:rPr>
+    </w:lvl>
+    <w:lvl w:ilvl="6" w:tplc="04160001" w:tentative="1">
+      <w:start w:val="1"/>
+      <w:numFmt w:val="bullet"/>
+      <w:lvlText w:val=""/>
+      <w:lvlJc w:val="left"/>
+      <w:pPr>
+        <w:ind w:left="5040" w:hanging="360"/>
+      </w:pPr>
+      <w:rPr>
+        <w:rFonts w:ascii="Symbol" w:hAnsi="Symbol" w:hint="default"/>
+      </w:rPr>
+    </w:lvl>
+    <w:lvl w:ilvl="7" w:tplc="04160003" w:tentative="1">
+      <w:start w:val="1"/>
+      <w:numFmt w:val="bullet"/>
+      <w:lvlText w:val="o"/>
+      <w:lvlJc w:val="left"/>
+      <w:pPr>
+        <w:ind w:left="5760" w:hanging="360"/>
+      </w:pPr>
+      <w:rPr>
+        <w:rFonts w:ascii="Courier New" w:hAnsi="Courier New" w:cs="Courier New" w:hint="default"/>
+      </w:rPr>
+    </w:lvl>
+    <w:lvl w:ilvl="8" w:tplc="04160005" w:tentative="1">
+      <w:start w:val="1"/>
+      <w:numFmt w:val="bullet"/>
+      <w:lvlText w:val=""/>
+      <w:lvlJc w:val="left"/>
+      <w:pPr>
+        <w:ind w:left="6480" w:hanging="360"/>
+      </w:pPr>
+      <w:rPr>
+        <w:rFonts w:ascii="Wingdings" w:hAnsi="Wingdings" w:hint="default"/>
+      </w:rPr>
+    </w:lvl>
+  </w:abstractNum>
+  <w:abstractNum w:abstractNumId="1" w15:restartNumberingAfterBreak="0">
+    <w:nsid w:val="467941C5"/>
+    <w:multiLevelType w:val="hybridMultilevel"/>
+    <w:tmpl w:val="CF683FAE"/>
+    <w:lvl w:ilvl="0" w:tplc="04160001">
+      <w:start w:val="1"/>
+      <w:numFmt w:val="bullet"/>
+      <w:lvlText w:val=""/>
+      <w:lvlJc w:val="left"/>
+      <w:pPr>
+        <w:ind w:left="720" w:hanging="360"/>
+      </w:pPr>
+      <w:rPr>
+        <w:rFonts w:ascii="Symbol" w:hAnsi="Symbol" w:hint="default"/>
+      </w:rPr>
+    </w:lvl>
+    <w:lvl w:ilvl="1" w:tplc="04160003" w:tentative="1">
+      <w:start w:val="1"/>
+      <w:numFmt w:val="bullet"/>
+      <w:lvlText w:val="o"/>
+      <w:lvlJc w:val="left"/>
+      <w:pPr>
+        <w:ind w:left="1440" w:hanging="360"/>
+      </w:pPr>
+      <w:rPr>
+        <w:rFonts w:ascii="Courier New" w:hAnsi="Courier New" w:cs="Courier New" w:hint="default"/>
+      </w:rPr>
+    </w:lvl>
+    <w:lvl w:ilvl="2" w:tplc="04160005" w:tentative="1">
+      <w:start w:val="1"/>
+      <w:numFmt w:val="bullet"/>
+      <w:lvlText w:val=""/>
+      <w:lvlJc w:val="left"/>
+      <w:pPr>
+        <w:ind w:left="2160" w:hanging="360"/>
+      </w:pPr>
+      <w:rPr>
+        <w:rFonts w:ascii="Wingdings" w:hAnsi="Wingdings" w:hint="default"/>
+      </w:rPr>
+    </w:lvl>
+    <w:lvl w:ilvl="3" w:tplc="04160001" w:tentative="1">
+      <w:start w:val="1"/>
+      <w:numFmt w:val="bullet"/>
+      <w:lvlText w:val=""/>
+      <w:lvlJc w:val="left"/>
+      <w:pPr>
+        <w:ind w:left="2880" w:hanging="360"/>
+      </w:pPr>
+      <w:rPr>
+        <w:rFonts w:ascii="Symbol" w:hAnsi="Symbol" w:hint="default"/>
+      </w:rPr>
+    </w:lvl>
+    <w:lvl w:ilvl="4" w:tplc="04160003" w:tentative="1">
+      <w:start w:val="1"/>
+      <w:numFmt w:val="bullet"/>
+      <w:lvlText w:val="o"/>
+      <w:lvlJc w:val="left"/>
+      <w:pPr>
+        <w:ind w:left="3600" w:hanging="360"/>
+      </w:pPr>
+      <w:rPr>
+        <w:rFonts w:ascii="Courier New" w:hAnsi="Courier New" w:cs="Courier New" w:hint="default"/>
+      </w:rPr>
+    </w:lvl>
+    <w:lvl w:ilvl="5" w:tplc="04160005" w:tentative="1">
+      <w:start w:val="1"/>
+      <w:numFmt w:val="bullet"/>
+      <w:lvlText w:val=""/>
+      <w:lvlJc w:val="left"/>
+      <w:pPr>
+        <w:ind w:left="4320" w:hanging="360"/>
+      </w:pPr>
+      <w:rPr>
+        <w:rFonts w:ascii="Wingdings" w:hAnsi="Wingdings" w:hint="default"/>
+      </w:rPr>
+    </w:lvl>
+    <w:lvl w:ilvl="6" w:tplc="04160001" w:tentative="1">
+      <w:start w:val="1"/>
+      <w:numFmt w:val="bullet"/>
+      <w:lvlText w:val=""/>
+      <w:lvlJc w:val="left"/>
+      <w:pPr>
+        <w:ind w:left="5040" w:hanging="360"/>
+      </w:pPr>
+      <w:rPr>
+        <w:rFonts w:ascii="Symbol" w:hAnsi="Symbol" w:hint="default"/>
+      </w:rPr>
+    </w:lvl>
+    <w:lvl w:ilvl="7" w:tplc="04160003" w:tentative="1">
+      <w:start w:val="1"/>
+      <w:numFmt w:val="bullet"/>
+      <w:lvlText w:val="o"/>
+      <w:lvlJc w:val="left"/>
+      <w:pPr>
+        <w:ind w:left="5760" w:hanging="360"/>
+      </w:pPr>
+      <w:rPr>
+        <w:rFonts w:ascii="Courier New" w:hAnsi="Courier New" w:cs="Courier New" w:hint="default"/>
+      </w:rPr>
+    </w:lvl>
+    <w:lvl w:ilvl="8" w:tplc="04160005" w:tentative="1">
+      <w:start w:val="1"/>
+      <w:numFmt w:val="bullet"/>
+      <w:lvlText w:val=""/>
+      <w:lvlJc w:val="left"/>
+      <w:pPr>
+        <w:ind w:left="6480" w:hanging="360"/>
+      </w:pPr>
+      <w:rPr>
+        <w:rFonts w:ascii="Wingdings" w:hAnsi="Wingdings" w:hint="default"/>
+      </w:rPr>
+    </w:lvl>
+  </w:abstractNum>
+  <w:abstractNum w:abstractNumId="2" w15:restartNumberingAfterBreak="0">
+    <w:nsid w:val="54F2173F"/>
+    <w:multiLevelType w:val="hybridMultilevel"/>
+    <w:tmpl w:val="1186B0E8"/>
+    <w:lvl w:ilvl="0" w:tplc="04160001">
+      <w:start w:val="1"/>
+      <w:numFmt w:val="bullet"/>
+      <w:lvlText w:val=""/>
+      <w:lvlJc w:val="left"/>
+      <w:pPr>
+        <w:ind w:left="502" w:hanging="360"/>
+      </w:pPr>
+      <w:rPr>
+        <w:rFonts w:ascii="Symbol" w:hAnsi="Symbol" w:hint="default"/>
+      </w:rPr>
+    </w:lvl>
+    <w:lvl w:ilvl="1" w:tplc="04160003" w:tentative="1">
+      <w:start w:val="1"/>
+      <w:numFmt w:val="bullet"/>
+      <w:lvlText w:val="o"/>
+      <w:lvlJc w:val="left"/>
+      <w:pPr>
+        <w:ind w:left="1222" w:hanging="360"/>
+      </w:pPr>
+      <w:rPr>
+        <w:rFonts w:ascii="Courier New" w:hAnsi="Courier New" w:cs="Courier New" w:hint="default"/>
+      </w:rPr>
+    </w:lvl>
+    <w:lvl w:ilvl="2" w:tplc="04160005" w:tentative="1">
+      <w:start w:val="1"/>
+      <w:numFmt w:val="bullet"/>
+      <w:lvlText w:val=""/>
+      <w:lvlJc w:val="left"/>
+      <w:pPr>
+        <w:ind w:left="1942" w:hanging="360"/>
+      </w:pPr>
+      <w:rPr>
+        <w:rFonts w:ascii="Wingdings" w:hAnsi="Wingdings" w:hint="default"/>
+      </w:rPr>
+    </w:lvl>
+    <w:lvl w:ilvl="3" w:tplc="04160001" w:tentative="1">
+      <w:start w:val="1"/>
+      <w:numFmt w:val="bullet"/>
+      <w:lvlText w:val=""/>
+      <w:lvlJc w:val="left"/>
+      <w:pPr>
+        <w:ind w:left="2662" w:hanging="360"/>
+      </w:pPr>
+      <w:rPr>
+        <w:rFonts w:ascii="Symbol" w:hAnsi="Symbol" w:hint="default"/>
+      </w:rPr>
+    </w:lvl>
+    <w:lvl w:ilvl="4" w:tplc="04160003" w:tentative="1">
+      <w:start w:val="1"/>
+      <w:numFmt w:val="bullet"/>
+      <w:lvlText w:val="o"/>
+      <w:lvlJc w:val="left"/>
+      <w:pPr>
+        <w:ind w:left="3382" w:hanging="360"/>
+      </w:pPr>
+      <w:rPr>
+        <w:rFonts w:ascii="Courier New" w:hAnsi="Courier New" w:cs="Courier New" w:hint="default"/>
+      </w:rPr>
+    </w:lvl>
+    <w:lvl w:ilvl="5" w:tplc="04160005" w:tentative="1">
+      <w:start w:val="1"/>
+      <w:numFmt w:val="bullet"/>
+      <w:lvlText w:val=""/>
+      <w:lvlJc w:val="left"/>
+      <w:pPr>
+        <w:ind w:left="4102" w:hanging="360"/>
+      </w:pPr>
+      <w:rPr>
+        <w:rFonts w:ascii="Wingdings" w:hAnsi="Wingdings" w:hint="default"/>
+      </w:rPr>
+    </w:lvl>
+    <w:lvl w:ilvl="6" w:tplc="04160001" w:tentative="1">
+      <w:start w:val="1"/>
+      <w:numFmt w:val="bullet"/>
+      <w:lvlText w:val=""/>
+      <w:lvlJc w:val="left"/>
+      <w:pPr>
+        <w:ind w:left="4822" w:hanging="360"/>
+      </w:pPr>
+      <w:rPr>
+        <w:rFonts w:ascii="Symbol" w:hAnsi="Symbol" w:hint="default"/>
+      </w:rPr>
+    </w:lvl>
+    <w:lvl w:ilvl="7" w:tplc="04160003" w:tentative="1">
+      <w:start w:val="1"/>
+      <w:numFmt w:val="bullet"/>
+      <w:lvlText w:val="o"/>
+      <w:lvlJc w:val="left"/>
+      <w:pPr>
+        <w:ind w:left="5542" w:hanging="360"/>
+      </w:pPr>
+      <w:rPr>
+        <w:rFonts w:ascii="Courier New" w:hAnsi="Courier New" w:cs="Courier New" w:hint="default"/>
+      </w:rPr>
+    </w:lvl>
+    <w:lvl w:ilvl="8" w:tplc="04160005" w:tentative="1">
+      <w:start w:val="1"/>
+      <w:numFmt w:val="bullet"/>
+      <w:lvlText w:val=""/>
+      <w:lvlJc w:val="left"/>
+      <w:pPr>
+        <w:ind w:left="6262" w:hanging="360"/>
+      </w:pPr>
+      <w:rPr>
+        <w:rFonts w:ascii="Wingdings" w:hAnsi="Wingdings" w:hint="default"/>
+      </w:rPr>
+    </w:lvl>
+  </w:abstractNum>
+  <w:num w:numId="1">
+    <w:abstractNumId w:val="1"/>
+  </w:num>
+  <w:num w:numId="2">
+    <w:abstractNumId w:val="0"/>
+  </w:num>
+  <w:num w:numId="3">
+    <w:abstractNumId w:val="2"/>
+  </w:num>
+</w:numbering>
 </file>
 
 <file path=word/styles.xml><?xml version="1.0" encoding="utf-8"?>

</xml_diff>

<commit_message>
feat: adiciona subtópico "A chama"
</commit_message>
<xml_diff>
--- a/vol-1/Além_do_Código-Livro_principal.docx
+++ b/vol-1/Além_do_Código-Livro_principal.docx
@@ -68,6 +68,7 @@
     <w:p>
       <w:pPr>
         <w:spacing w:after="0" w:line="240" w:lineRule="auto"/>
+        <w:jc w:val="right"/>
         <w:rPr>
           <w:rFonts w:ascii="Ink Free" w:eastAsia="Ink Free" w:hAnsi="Ink Free" w:cs="Ink Free"/>
           <w:b/>
@@ -106,7 +107,17 @@
           <w:sz w:val="32"/>
           <w:szCs w:val="32"/>
         </w:rPr>
-        <w:t>02</w:t>
+        <w:t>0</w:t>
+      </w:r>
+      <w:r>
+        <w:rPr>
+          <w:rFonts w:ascii="Brush Script MT" w:eastAsia="Ink Free" w:hAnsi="Brush Script MT" w:cs="Ink Free"/>
+          <w:b/>
+          <w:bCs/>
+          <w:sz w:val="32"/>
+          <w:szCs w:val="32"/>
+        </w:rPr>
+        <w:t>1</w:t>
       </w:r>
     </w:p>
     <w:p>
@@ -241,15 +252,57 @@
     </w:p>
     <w:p>
       <w:pPr>
-        <w:rPr>
-          <w:rFonts w:ascii="Georgia" w:eastAsia="Times New Roman" w:hAnsi="Georgia" w:cs="Times New Roman"/>
-        </w:rPr>
-      </w:pPr>
-      <w:r>
-        <w:rPr>
-          <w:rFonts w:ascii="Georgia" w:eastAsia="Times New Roman" w:hAnsi="Georgia" w:cs="Times New Roman"/>
+        <w:jc w:val="both"/>
+        <w:rPr>
+          <w:rFonts w:ascii="Brush Script MT" w:eastAsia="Arial" w:hAnsi="Brush Script MT" w:cs="Arial"/>
+          <w:b/>
+          <w:bCs/>
+          <w:sz w:val="32"/>
+          <w:szCs w:val="32"/>
+        </w:rPr>
+      </w:pPr>
+      <w:r>
+        <w:rPr>
+          <w:rFonts w:ascii="Brush Script MT" w:eastAsia="Arial" w:hAnsi="Brush Script MT" w:cs="Arial"/>
+          <w:b/>
+          <w:bCs/>
+          <w:sz w:val="32"/>
+          <w:szCs w:val="32"/>
         </w:rPr>
         <w:lastRenderedPageBreak/>
+        <w:t xml:space="preserve">                                                                     </w:t>
+      </w:r>
+      <w:r>
+        <w:rPr>
+          <w:rFonts w:ascii="Brush Script MT" w:eastAsia="Arial" w:hAnsi="Brush Script MT" w:cs="Arial"/>
+          <w:b/>
+          <w:bCs/>
+          <w:sz w:val="32"/>
+          <w:szCs w:val="32"/>
+        </w:rPr>
+        <w:t>0</w:t>
+      </w:r>
+      <w:r>
+        <w:rPr>
+          <w:rFonts w:ascii="Brush Script MT" w:eastAsia="Arial" w:hAnsi="Brush Script MT" w:cs="Arial"/>
+          <w:b/>
+          <w:bCs/>
+          <w:sz w:val="32"/>
+          <w:szCs w:val="32"/>
+        </w:rPr>
+        <w:t>2</w:t>
+      </w:r>
+    </w:p>
+    <w:p>
+      <w:pPr>
+        <w:rPr>
+          <w:rFonts w:ascii="Georgia" w:eastAsia="Times New Roman" w:hAnsi="Georgia" w:cs="Times New Roman"/>
+        </w:rPr>
+      </w:pPr>
+      <w:r>
+        <w:rPr>
+          <w:rFonts w:ascii="Georgia" w:eastAsia="Times New Roman" w:hAnsi="Georgia" w:cs="Times New Roman"/>
+        </w:rPr>
         <w:t>Capítulo 1 – A Faísca na Tela ........................................ 0</w:t>
       </w:r>
       <w:r>
@@ -295,7 +348,21 @@
         <w:rPr>
           <w:rFonts w:ascii="Georgia" w:eastAsia="Times New Roman" w:hAnsi="Georgia" w:cs="Times New Roman"/>
         </w:rPr>
-        <w:t>Capítulo 4 – A Linha que se Rompe ................................... 23</w:t>
+        <w:t xml:space="preserve">Capítulo 4 – A Linha que </w:t>
+      </w:r>
+      <w:proofErr w:type="gramStart"/>
+      <w:r>
+        <w:rPr>
+          <w:rFonts w:ascii="Georgia" w:eastAsia="Times New Roman" w:hAnsi="Georgia" w:cs="Times New Roman"/>
+        </w:rPr>
+        <w:t>se Rompe</w:t>
+      </w:r>
+      <w:proofErr w:type="gramEnd"/>
+      <w:r>
+        <w:rPr>
+          <w:rFonts w:ascii="Georgia" w:eastAsia="Times New Roman" w:hAnsi="Georgia" w:cs="Times New Roman"/>
+        </w:rPr>
+        <w:t xml:space="preserve"> ................................... 23</w:t>
       </w:r>
     </w:p>
     <w:p>
@@ -430,6 +497,27 @@
     </w:p>
     <w:p>
       <w:pPr>
+        <w:jc w:val="right"/>
+        <w:rPr>
+          <w:rFonts w:ascii="Brush Script MT" w:eastAsia="Arial" w:hAnsi="Brush Script MT" w:cs="Arial"/>
+          <w:b/>
+          <w:bCs/>
+          <w:sz w:val="32"/>
+          <w:szCs w:val="32"/>
+        </w:rPr>
+      </w:pPr>
+      <w:r>
+        <w:rPr>
+          <w:rFonts w:ascii="Georgia" w:eastAsia="Arial" w:hAnsi="Georgia" w:cs="Arial"/>
+          <w:b/>
+          <w:bCs/>
+          <w:sz w:val="40"/>
+          <w:szCs w:val="40"/>
+        </w:rPr>
+        <w:lastRenderedPageBreak/>
+        <w:t>A Faísca na Tela</w:t>
+      </w:r>
+      <w:r>
         <w:rPr>
           <w:rFonts w:ascii="Arial" w:eastAsia="Arial" w:hAnsi="Arial" w:cs="Arial"/>
           <w:b/>
@@ -437,10 +525,9 @@
           <w:sz w:val="48"/>
           <w:szCs w:val="48"/>
         </w:rPr>
-      </w:pPr>
-    </w:p>
-    <w:p>
-      <w:pPr>
+        <w:t xml:space="preserve">            </w:t>
+      </w:r>
+      <w:r>
         <w:rPr>
           <w:rFonts w:ascii="Brush Script MT" w:eastAsia="Arial" w:hAnsi="Brush Script MT" w:cs="Arial"/>
           <w:b/>
@@ -448,27 +535,7 @@
           <w:sz w:val="32"/>
           <w:szCs w:val="32"/>
         </w:rPr>
-      </w:pPr>
-      <w:r>
-        <w:rPr>
-          <w:rFonts w:ascii="Georgia" w:eastAsia="Arial" w:hAnsi="Georgia" w:cs="Arial"/>
-          <w:b/>
-          <w:bCs/>
-          <w:sz w:val="40"/>
-          <w:szCs w:val="40"/>
-        </w:rPr>
-        <w:lastRenderedPageBreak/>
-        <w:t>A Faísca na Tela</w:t>
-      </w:r>
-      <w:r>
-        <w:rPr>
-          <w:rFonts w:ascii="Arial" w:eastAsia="Arial" w:hAnsi="Arial" w:cs="Arial"/>
-          <w:b/>
-          <w:bCs/>
-          <w:sz w:val="48"/>
-          <w:szCs w:val="48"/>
-        </w:rPr>
-        <w:t xml:space="preserve">            </w:t>
+        <w:t xml:space="preserve">   </w:t>
       </w:r>
       <w:r>
         <w:rPr>
@@ -478,7 +545,7 @@
           <w:sz w:val="32"/>
           <w:szCs w:val="32"/>
         </w:rPr>
-        <w:t xml:space="preserve">   </w:t>
+        <w:t xml:space="preserve">           </w:t>
       </w:r>
       <w:r>
         <w:rPr>
@@ -488,7 +555,7 @@
           <w:sz w:val="32"/>
           <w:szCs w:val="32"/>
         </w:rPr>
-        <w:t xml:space="preserve">           </w:t>
+        <w:t>0</w:t>
       </w:r>
       <w:r>
         <w:rPr>
@@ -498,7 +565,7 @@
           <w:sz w:val="32"/>
           <w:szCs w:val="32"/>
         </w:rPr>
-        <w:t>04</w:t>
+        <w:t>3</w:t>
       </w:r>
     </w:p>
     <w:p>
@@ -706,7 +773,7 @@
         <w:pStyle w:val="NormalWeb"/>
         <w:jc w:val="right"/>
         <w:rPr>
-          <w:rFonts w:ascii="Ink Free" w:hAnsi="Ink Free"/>
+          <w:rFonts w:ascii="Brush Script MT" w:hAnsi="Brush Script MT"/>
           <w:b/>
           <w:bCs/>
           <w:sz w:val="32"/>
@@ -715,14 +782,24 @@
       </w:pPr>
       <w:r>
         <w:rPr>
-          <w:rFonts w:ascii="Ink Free" w:hAnsi="Ink Free"/>
+          <w:rFonts w:ascii="Brush Script MT" w:hAnsi="Brush Script MT"/>
           <w:b/>
           <w:bCs/>
           <w:sz w:val="32"/>
           <w:szCs w:val="32"/>
         </w:rPr>
         <w:lastRenderedPageBreak/>
-        <w:t>05</w:t>
+        <w:t>0</w:t>
+      </w:r>
+      <w:r>
+        <w:rPr>
+          <w:rFonts w:ascii="Brush Script MT" w:hAnsi="Brush Script MT"/>
+          <w:b/>
+          <w:bCs/>
+          <w:sz w:val="32"/>
+          <w:szCs w:val="32"/>
+        </w:rPr>
+        <w:t>4</w:t>
       </w:r>
     </w:p>
     <w:p>
@@ -751,27 +828,737 @@
           <w:numId w:val="3"/>
         </w:numPr>
         <w:rPr>
+          <w:rFonts w:ascii="Garamond" w:hAnsi="Garamond" w:cs="Liberation Mono"/>
+          <w:b/>
+          <w:bCs/>
+          <w:i/>
+          <w:iCs/>
+          <w:sz w:val="30"/>
+          <w:szCs w:val="30"/>
+        </w:rPr>
+      </w:pPr>
+      <w:r>
+        <w:rPr>
+          <w:rFonts w:ascii="Garamond" w:hAnsi="Garamond" w:cs="Liberation Mono"/>
+          <w:b/>
+          <w:bCs/>
+          <w:i/>
+          <w:iCs/>
+          <w:sz w:val="30"/>
+          <w:szCs w:val="30"/>
+        </w:rPr>
+        <w:t>A chama</w:t>
+      </w:r>
+    </w:p>
+    <w:p>
+      <w:pPr>
+        <w:spacing w:before="100" w:beforeAutospacing="1" w:after="100" w:afterAutospacing="1" w:line="240" w:lineRule="auto"/>
+        <w:rPr>
+          <w:rFonts w:ascii="Georgia" w:eastAsia="Times New Roman" w:hAnsi="Georgia" w:cs="Times New Roman"/>
+          <w:sz w:val="22"/>
+          <w:szCs w:val="22"/>
+        </w:rPr>
+      </w:pPr>
+      <w:r>
+        <w:rPr>
+          <w:rFonts w:ascii="Georgia" w:eastAsia="Times New Roman" w:hAnsi="Georgia" w:cs="Times New Roman"/>
+          <w:sz w:val="22"/>
+          <w:szCs w:val="22"/>
+        </w:rPr>
+        <w:t>No dia seguinte, Adriel acordou cedo e foi para a escola ainda com a frase do Mark Zuckerberg martelando na cabeça.</w:t>
+      </w:r>
+    </w:p>
+    <w:p>
+      <w:pPr>
+        <w:spacing w:before="100" w:beforeAutospacing="1" w:after="100" w:afterAutospacing="1" w:line="240" w:lineRule="auto"/>
+        <w:rPr>
+          <w:rFonts w:ascii="Georgia" w:eastAsia="Times New Roman" w:hAnsi="Georgia" w:cs="Times New Roman"/>
+          <w:sz w:val="22"/>
+          <w:szCs w:val="22"/>
+        </w:rPr>
+      </w:pPr>
+      <w:r>
+        <w:rPr>
+          <w:rFonts w:ascii="Georgia" w:eastAsia="Times New Roman" w:hAnsi="Georgia" w:cs="Times New Roman"/>
+          <w:sz w:val="22"/>
+          <w:szCs w:val="22"/>
+        </w:rPr>
+        <w:t>Assim que chegou no pátio, avistou Kaio encostado no muro de sempre, mexendo no celular.</w:t>
+      </w:r>
+    </w:p>
+    <w:p>
+      <w:pPr>
+        <w:spacing w:before="100" w:beforeAutospacing="1" w:after="100" w:afterAutospacing="1" w:line="240" w:lineRule="auto"/>
+        <w:rPr>
+          <w:rFonts w:ascii="Georgia" w:eastAsia="Times New Roman" w:hAnsi="Georgia" w:cs="Times New Roman"/>
+          <w:sz w:val="22"/>
+          <w:szCs w:val="22"/>
+        </w:rPr>
+      </w:pPr>
+      <w:r>
+        <w:rPr>
+          <w:rFonts w:ascii="Georgia" w:eastAsia="Times New Roman" w:hAnsi="Georgia" w:cs="Times New Roman"/>
+          <w:sz w:val="22"/>
+          <w:szCs w:val="22"/>
+        </w:rPr>
+        <w:t>— E aí, Kaio! — gritou Adriel, se aproximando com um sorriso diferente.</w:t>
+      </w:r>
+    </w:p>
+    <w:p>
+      <w:pPr>
+        <w:spacing w:before="100" w:beforeAutospacing="1" w:after="100" w:afterAutospacing="1" w:line="240" w:lineRule="auto"/>
+        <w:rPr>
+          <w:rFonts w:ascii="Georgia" w:eastAsia="Times New Roman" w:hAnsi="Georgia" w:cs="Times New Roman"/>
+          <w:sz w:val="22"/>
+          <w:szCs w:val="22"/>
+        </w:rPr>
+      </w:pPr>
+      <w:r>
+        <w:rPr>
+          <w:rFonts w:ascii="Georgia" w:eastAsia="Times New Roman" w:hAnsi="Georgia" w:cs="Times New Roman"/>
+          <w:sz w:val="22"/>
+          <w:szCs w:val="22"/>
+        </w:rPr>
+        <w:t>— Fala, mano. Tá animado hoje? Tá com uma cara estranha...</w:t>
+      </w:r>
+    </w:p>
+    <w:p>
+      <w:pPr>
+        <w:spacing w:before="100" w:beforeAutospacing="1" w:after="100" w:afterAutospacing="1" w:line="240" w:lineRule="auto"/>
+        <w:rPr>
+          <w:rFonts w:ascii="Georgia" w:eastAsia="Times New Roman" w:hAnsi="Georgia" w:cs="Times New Roman"/>
+          <w:sz w:val="22"/>
+          <w:szCs w:val="22"/>
+        </w:rPr>
+      </w:pPr>
+      <w:r>
+        <w:rPr>
+          <w:rFonts w:ascii="Georgia" w:eastAsia="Times New Roman" w:hAnsi="Georgia" w:cs="Times New Roman"/>
+          <w:sz w:val="22"/>
+          <w:szCs w:val="22"/>
+        </w:rPr>
+        <w:t>Adriel parou na frente dele, quase sem conseguir conter a empolgação.</w:t>
+      </w:r>
+    </w:p>
+    <w:p>
+      <w:pPr>
+        <w:spacing w:before="100" w:beforeAutospacing="1" w:after="100" w:afterAutospacing="1" w:line="240" w:lineRule="auto"/>
+        <w:rPr>
+          <w:rFonts w:ascii="Georgia" w:eastAsia="Times New Roman" w:hAnsi="Georgia" w:cs="Times New Roman"/>
+          <w:sz w:val="22"/>
+          <w:szCs w:val="22"/>
+        </w:rPr>
+      </w:pPr>
+      <w:r>
+        <w:rPr>
+          <w:rFonts w:ascii="Georgia" w:eastAsia="Times New Roman" w:hAnsi="Georgia" w:cs="Times New Roman"/>
+          <w:sz w:val="22"/>
+          <w:szCs w:val="22"/>
+        </w:rPr>
+        <w:t>— Cara, ontem eu vi uma reportagem foda na TV. O Mark Zuckerberg falou uma parada que não saiu da minha cabeça: “Se você domina o computador, você domina o mundo.”</w:t>
+      </w:r>
+    </w:p>
+    <w:p>
+      <w:pPr>
+        <w:spacing w:before="100" w:beforeAutospacing="1" w:after="100" w:afterAutospacing="1" w:line="240" w:lineRule="auto"/>
+        <w:rPr>
+          <w:rFonts w:ascii="Georgia" w:eastAsia="Times New Roman" w:hAnsi="Georgia" w:cs="Times New Roman"/>
+          <w:sz w:val="22"/>
+          <w:szCs w:val="22"/>
+        </w:rPr>
+      </w:pPr>
+      <w:r>
+        <w:rPr>
+          <w:rFonts w:ascii="Georgia" w:eastAsia="Times New Roman" w:hAnsi="Georgia" w:cs="Times New Roman"/>
+          <w:sz w:val="22"/>
+          <w:szCs w:val="22"/>
+        </w:rPr>
+        <w:t>Kaio olhou para ele por dois segundos e caiu na gargalhada.</w:t>
+      </w:r>
+    </w:p>
+    <w:p>
+      <w:pPr>
+        <w:spacing w:before="100" w:beforeAutospacing="1" w:after="100" w:afterAutospacing="1" w:line="240" w:lineRule="auto"/>
+        <w:rPr>
+          <w:rFonts w:ascii="Georgia" w:eastAsia="Times New Roman" w:hAnsi="Georgia" w:cs="Times New Roman"/>
+          <w:sz w:val="22"/>
+          <w:szCs w:val="22"/>
+        </w:rPr>
+      </w:pPr>
+      <w:r>
+        <w:rPr>
+          <w:rFonts w:ascii="Georgia" w:eastAsia="Times New Roman" w:hAnsi="Georgia" w:cs="Times New Roman"/>
+          <w:sz w:val="22"/>
+          <w:szCs w:val="22"/>
+        </w:rPr>
+        <w:t xml:space="preserve">— Tu tá bem? Desde quando </w:t>
+      </w:r>
+      <w:proofErr w:type="gramStart"/>
+      <w:r>
+        <w:rPr>
+          <w:rFonts w:ascii="Georgia" w:eastAsia="Times New Roman" w:hAnsi="Georgia" w:cs="Times New Roman"/>
+          <w:sz w:val="22"/>
+          <w:szCs w:val="22"/>
+        </w:rPr>
+        <w:t>tu se interessa</w:t>
+      </w:r>
+      <w:proofErr w:type="gramEnd"/>
+      <w:r>
+        <w:rPr>
+          <w:rFonts w:ascii="Georgia" w:eastAsia="Times New Roman" w:hAnsi="Georgia" w:cs="Times New Roman"/>
+          <w:sz w:val="22"/>
+          <w:szCs w:val="22"/>
+        </w:rPr>
+        <w:t xml:space="preserve"> por essas coisas? Vai estudar pra prova de matemática que é melhor, Adriel.</w:t>
+      </w:r>
+    </w:p>
+    <w:p>
+      <w:pPr>
+        <w:spacing w:before="100" w:beforeAutospacing="1" w:after="100" w:afterAutospacing="1" w:line="240" w:lineRule="auto"/>
+        <w:rPr>
+          <w:rFonts w:ascii="Georgia" w:eastAsia="Times New Roman" w:hAnsi="Georgia" w:cs="Times New Roman"/>
+          <w:sz w:val="22"/>
+          <w:szCs w:val="22"/>
+        </w:rPr>
+      </w:pPr>
+      <w:r>
+        <w:rPr>
+          <w:rFonts w:ascii="Georgia" w:eastAsia="Times New Roman" w:hAnsi="Georgia" w:cs="Times New Roman"/>
+          <w:sz w:val="22"/>
+          <w:szCs w:val="22"/>
+        </w:rPr>
+        <w:t xml:space="preserve">— </w:t>
+      </w:r>
+      <w:proofErr w:type="spellStart"/>
+      <w:r>
+        <w:rPr>
+          <w:rFonts w:ascii="Georgia" w:eastAsia="Times New Roman" w:hAnsi="Georgia" w:cs="Times New Roman"/>
+          <w:sz w:val="22"/>
+          <w:szCs w:val="22"/>
+        </w:rPr>
+        <w:t>Tô</w:t>
+      </w:r>
+      <w:proofErr w:type="spellEnd"/>
+      <w:r>
+        <w:rPr>
+          <w:rFonts w:ascii="Georgia" w:eastAsia="Times New Roman" w:hAnsi="Georgia" w:cs="Times New Roman"/>
+          <w:sz w:val="22"/>
+          <w:szCs w:val="22"/>
+        </w:rPr>
+        <w:t xml:space="preserve"> falando sério! — insistiu Adriel. — Fiquei pensando a noite inteira. Como que uma pessoa consegue criar algo daquele tamanho?</w:t>
+      </w:r>
+    </w:p>
+    <w:p>
+      <w:pPr>
+        <w:spacing w:before="100" w:beforeAutospacing="1" w:after="100" w:afterAutospacing="1" w:line="240" w:lineRule="auto"/>
+        <w:rPr>
+          <w:rFonts w:ascii="Georgia" w:eastAsia="Times New Roman" w:hAnsi="Georgia" w:cs="Times New Roman"/>
+          <w:sz w:val="22"/>
+          <w:szCs w:val="22"/>
+        </w:rPr>
+      </w:pPr>
+      <w:r>
+        <w:rPr>
+          <w:rFonts w:ascii="Georgia" w:eastAsia="Times New Roman" w:hAnsi="Georgia" w:cs="Times New Roman"/>
+          <w:sz w:val="22"/>
+          <w:szCs w:val="22"/>
+        </w:rPr>
+        <w:t xml:space="preserve">Os dois começaram a andar em direção à sala. Durante toda a aula de Matemática, Adriel não conseguiu prestar atenção em nada. A </w:t>
+      </w:r>
+    </w:p>
+    <w:p>
+      <w:pPr>
+        <w:pStyle w:val="NormalWeb"/>
+        <w:jc w:val="right"/>
+        <w:rPr>
+          <w:rFonts w:ascii="Ink Free" w:hAnsi="Ink Free"/>
+          <w:b/>
+          <w:bCs/>
+          <w:sz w:val="32"/>
+          <w:szCs w:val="32"/>
+        </w:rPr>
+      </w:pPr>
+    </w:p>
+    <w:p>
+      <w:pPr>
+        <w:pStyle w:val="NormalWeb"/>
+        <w:jc w:val="right"/>
+        <w:rPr>
+          <w:rFonts w:ascii="Brush Script MT" w:hAnsi="Brush Script MT"/>
+          <w:b/>
+          <w:bCs/>
+          <w:sz w:val="32"/>
+          <w:szCs w:val="32"/>
+        </w:rPr>
+      </w:pPr>
+      <w:r>
+        <w:rPr>
+          <w:rFonts w:ascii="Ink Free" w:hAnsi="Ink Free"/>
+          <w:b/>
+          <w:bCs/>
+          <w:sz w:val="32"/>
+          <w:szCs w:val="32"/>
+        </w:rPr>
+        <w:lastRenderedPageBreak/>
+        <w:t xml:space="preserve">      </w:t>
+      </w:r>
+      <w:r>
+        <w:rPr>
+          <w:rFonts w:ascii="Brush Script MT" w:hAnsi="Brush Script MT"/>
+          <w:b/>
+          <w:bCs/>
+          <w:sz w:val="32"/>
+          <w:szCs w:val="32"/>
+        </w:rPr>
+        <w:t>0</w:t>
+      </w:r>
+      <w:r>
+        <w:rPr>
+          <w:rFonts w:ascii="Brush Script MT" w:hAnsi="Brush Script MT"/>
+          <w:b/>
+          <w:bCs/>
+          <w:sz w:val="32"/>
+          <w:szCs w:val="32"/>
+        </w:rPr>
+        <w:t>5</w:t>
+      </w:r>
+    </w:p>
+    <w:p>
+      <w:pPr>
+        <w:spacing w:before="100" w:beforeAutospacing="1" w:after="100" w:afterAutospacing="1" w:line="240" w:lineRule="auto"/>
+        <w:rPr>
+          <w:rFonts w:ascii="Georgia" w:eastAsia="Times New Roman" w:hAnsi="Georgia" w:cs="Times New Roman"/>
+          <w:sz w:val="22"/>
+          <w:szCs w:val="22"/>
+        </w:rPr>
+      </w:pPr>
+      <w:r>
+        <w:rPr>
+          <w:rFonts w:ascii="Georgia" w:eastAsia="Times New Roman" w:hAnsi="Georgia" w:cs="Times New Roman"/>
+          <w:sz w:val="22"/>
+          <w:szCs w:val="22"/>
+        </w:rPr>
+        <w:t>frase não parava de voltar. Quando o sinal do intervalo tocou, ele não foi pro pátio. Foi direto para a sala de informática.</w:t>
+      </w:r>
+    </w:p>
+    <w:p>
+      <w:pPr>
+        <w:spacing w:before="100" w:beforeAutospacing="1" w:after="100" w:afterAutospacing="1" w:line="240" w:lineRule="auto"/>
+        <w:rPr>
+          <w:rFonts w:ascii="Georgia" w:eastAsia="Times New Roman" w:hAnsi="Georgia" w:cs="Times New Roman"/>
+          <w:sz w:val="22"/>
+          <w:szCs w:val="22"/>
+        </w:rPr>
+      </w:pPr>
+      <w:r>
+        <w:rPr>
+          <w:rFonts w:ascii="Georgia" w:eastAsia="Times New Roman" w:hAnsi="Georgia" w:cs="Times New Roman"/>
+          <w:sz w:val="22"/>
+          <w:szCs w:val="22"/>
+        </w:rPr>
+        <w:t>O professor Oliveira estava corrigindo provas na mesa.</w:t>
+      </w:r>
+    </w:p>
+    <w:p>
+      <w:pPr>
+        <w:spacing w:before="100" w:beforeAutospacing="1" w:after="100" w:afterAutospacing="1" w:line="240" w:lineRule="auto"/>
+        <w:rPr>
+          <w:rFonts w:ascii="Georgia" w:eastAsia="Times New Roman" w:hAnsi="Georgia" w:cs="Times New Roman"/>
+          <w:sz w:val="22"/>
+          <w:szCs w:val="22"/>
+        </w:rPr>
+      </w:pPr>
+      <w:r>
+        <w:rPr>
+          <w:rFonts w:ascii="Georgia" w:eastAsia="Times New Roman" w:hAnsi="Georgia" w:cs="Times New Roman"/>
+          <w:sz w:val="22"/>
+          <w:szCs w:val="22"/>
+        </w:rPr>
+        <w:t>— Professor, posso fazer uma pergunta?</w:t>
+      </w:r>
+    </w:p>
+    <w:p>
+      <w:pPr>
+        <w:spacing w:before="100" w:beforeAutospacing="1" w:after="100" w:afterAutospacing="1" w:line="240" w:lineRule="auto"/>
+        <w:rPr>
+          <w:rFonts w:ascii="Georgia" w:eastAsia="Times New Roman" w:hAnsi="Georgia" w:cs="Times New Roman"/>
+          <w:sz w:val="22"/>
+          <w:szCs w:val="22"/>
+        </w:rPr>
+      </w:pPr>
+      <w:r>
+        <w:rPr>
+          <w:rFonts w:ascii="Georgia" w:eastAsia="Times New Roman" w:hAnsi="Georgia" w:cs="Times New Roman"/>
+          <w:sz w:val="22"/>
+          <w:szCs w:val="22"/>
+        </w:rPr>
+        <w:t>O homem levantou os olhos, surpreso. Adriel quase nunca aparecia ali.</w:t>
+      </w:r>
+    </w:p>
+    <w:p>
+      <w:pPr>
+        <w:spacing w:before="100" w:beforeAutospacing="1" w:after="100" w:afterAutospacing="1" w:line="240" w:lineRule="auto"/>
+        <w:rPr>
+          <w:rFonts w:ascii="Georgia" w:eastAsia="Times New Roman" w:hAnsi="Georgia" w:cs="Times New Roman"/>
+          <w:sz w:val="22"/>
+          <w:szCs w:val="22"/>
+        </w:rPr>
+      </w:pPr>
+      <w:r>
+        <w:rPr>
+          <w:rFonts w:ascii="Georgia" w:eastAsia="Times New Roman" w:hAnsi="Georgia" w:cs="Times New Roman"/>
+          <w:sz w:val="22"/>
+          <w:szCs w:val="22"/>
+        </w:rPr>
+        <w:t>— Pode.</w:t>
+      </w:r>
+    </w:p>
+    <w:p>
+      <w:pPr>
+        <w:spacing w:before="100" w:beforeAutospacing="1" w:after="100" w:afterAutospacing="1" w:line="240" w:lineRule="auto"/>
+        <w:rPr>
+          <w:rFonts w:ascii="Georgia" w:eastAsia="Times New Roman" w:hAnsi="Georgia" w:cs="Times New Roman"/>
+          <w:sz w:val="22"/>
+          <w:szCs w:val="22"/>
+        </w:rPr>
+      </w:pPr>
+      <w:r>
+        <w:rPr>
+          <w:rFonts w:ascii="Georgia" w:eastAsia="Times New Roman" w:hAnsi="Georgia" w:cs="Times New Roman"/>
+          <w:sz w:val="22"/>
+          <w:szCs w:val="22"/>
+        </w:rPr>
+        <w:t>Adriel respirou fundo.</w:t>
+      </w:r>
+    </w:p>
+    <w:p>
+      <w:pPr>
+        <w:spacing w:before="100" w:beforeAutospacing="1" w:after="100" w:afterAutospacing="1" w:line="240" w:lineRule="auto"/>
+        <w:rPr>
+          <w:rFonts w:ascii="Georgia" w:eastAsia="Times New Roman" w:hAnsi="Georgia" w:cs="Times New Roman"/>
+          <w:sz w:val="22"/>
+          <w:szCs w:val="22"/>
+        </w:rPr>
+      </w:pPr>
+      <w:r>
+        <w:rPr>
+          <w:rFonts w:ascii="Georgia" w:eastAsia="Times New Roman" w:hAnsi="Georgia" w:cs="Times New Roman"/>
+          <w:sz w:val="22"/>
+          <w:szCs w:val="22"/>
+        </w:rPr>
+        <w:t>— Como o Mark Zuckerberg criou o Facebook? Tipo… ele fez tudo sozinho? Como funciona isso?</w:t>
+      </w:r>
+    </w:p>
+    <w:p>
+      <w:pPr>
+        <w:spacing w:before="100" w:beforeAutospacing="1" w:after="100" w:afterAutospacing="1" w:line="240" w:lineRule="auto"/>
+        <w:rPr>
+          <w:rFonts w:ascii="Georgia" w:eastAsia="Times New Roman" w:hAnsi="Georgia" w:cs="Times New Roman"/>
+          <w:sz w:val="22"/>
+          <w:szCs w:val="22"/>
+        </w:rPr>
+      </w:pPr>
+      <w:r>
+        <w:rPr>
+          <w:rFonts w:ascii="Georgia" w:eastAsia="Times New Roman" w:hAnsi="Georgia" w:cs="Times New Roman"/>
+          <w:sz w:val="22"/>
+          <w:szCs w:val="22"/>
+        </w:rPr>
+        <w:t>O professor deu um sorriso irônico, tirando os óculos.</w:t>
+      </w:r>
+    </w:p>
+    <w:p>
+      <w:pPr>
+        <w:spacing w:before="100" w:beforeAutospacing="1" w:after="100" w:afterAutospacing="1" w:line="240" w:lineRule="auto"/>
+        <w:rPr>
+          <w:rFonts w:ascii="Georgia" w:eastAsia="Times New Roman" w:hAnsi="Georgia" w:cs="Times New Roman"/>
+          <w:sz w:val="22"/>
+          <w:szCs w:val="22"/>
+        </w:rPr>
+      </w:pPr>
+      <w:r>
+        <w:rPr>
+          <w:rFonts w:ascii="Georgia" w:eastAsia="Times New Roman" w:hAnsi="Georgia" w:cs="Times New Roman"/>
+          <w:sz w:val="22"/>
+          <w:szCs w:val="22"/>
+        </w:rPr>
+        <w:t>— Ele desenvolveu um sistema inteiro usando linguagem de programação. Não é mágica, Adriel. É estudo, lógica e muito trabalho.</w:t>
+      </w:r>
+    </w:p>
+    <w:p>
+      <w:pPr>
+        <w:spacing w:before="100" w:beforeAutospacing="1" w:after="100" w:afterAutospacing="1" w:line="240" w:lineRule="auto"/>
+        <w:rPr>
+          <w:rFonts w:ascii="Georgia" w:eastAsia="Times New Roman" w:hAnsi="Georgia" w:cs="Times New Roman"/>
+          <w:sz w:val="22"/>
+          <w:szCs w:val="22"/>
+        </w:rPr>
+      </w:pPr>
+      <w:r>
+        <w:rPr>
+          <w:rFonts w:ascii="Georgia" w:eastAsia="Times New Roman" w:hAnsi="Georgia" w:cs="Times New Roman"/>
+          <w:sz w:val="22"/>
+          <w:szCs w:val="22"/>
+        </w:rPr>
+        <w:t>Adriel ficou quieto por um segundo, depois soltou:</w:t>
+      </w:r>
+    </w:p>
+    <w:p>
+      <w:pPr>
+        <w:spacing w:before="100" w:beforeAutospacing="1" w:after="100" w:afterAutospacing="1" w:line="240" w:lineRule="auto"/>
+        <w:rPr>
+          <w:rFonts w:ascii="Georgia" w:eastAsia="Times New Roman" w:hAnsi="Georgia" w:cs="Times New Roman"/>
+          <w:sz w:val="22"/>
+          <w:szCs w:val="22"/>
+        </w:rPr>
+      </w:pPr>
+      <w:r>
+        <w:rPr>
+          <w:rFonts w:ascii="Georgia" w:eastAsia="Times New Roman" w:hAnsi="Georgia" w:cs="Times New Roman"/>
+          <w:sz w:val="22"/>
+          <w:szCs w:val="22"/>
+        </w:rPr>
+        <w:t>— E se eu quisesse aprender? O senhor acha que eu conseguiria?</w:t>
+      </w:r>
+    </w:p>
+    <w:p>
+      <w:pPr>
+        <w:spacing w:before="100" w:beforeAutospacing="1" w:after="100" w:afterAutospacing="1" w:line="240" w:lineRule="auto"/>
+        <w:rPr>
+          <w:rFonts w:ascii="Georgia" w:eastAsia="Times New Roman" w:hAnsi="Georgia" w:cs="Times New Roman"/>
+          <w:sz w:val="22"/>
+          <w:szCs w:val="22"/>
+        </w:rPr>
+      </w:pPr>
+      <w:r>
+        <w:rPr>
+          <w:rFonts w:ascii="Georgia" w:eastAsia="Times New Roman" w:hAnsi="Georgia" w:cs="Times New Roman"/>
+          <w:sz w:val="22"/>
+          <w:szCs w:val="22"/>
+        </w:rPr>
+        <w:t>O professor Oliveira soltou uma risada baixa, quase debochada.</w:t>
+      </w:r>
+    </w:p>
+    <w:p>
+      <w:pPr>
+        <w:spacing w:before="100" w:beforeAutospacing="1" w:after="100" w:afterAutospacing="1" w:line="240" w:lineRule="auto"/>
+        <w:rPr>
+          <w:rFonts w:ascii="Georgia" w:eastAsia="Times New Roman" w:hAnsi="Georgia" w:cs="Times New Roman"/>
+          <w:sz w:val="22"/>
+          <w:szCs w:val="22"/>
+        </w:rPr>
+      </w:pPr>
+      <w:r>
+        <w:rPr>
+          <w:rFonts w:ascii="Georgia" w:eastAsia="Times New Roman" w:hAnsi="Georgia" w:cs="Times New Roman"/>
+          <w:sz w:val="22"/>
+          <w:szCs w:val="22"/>
+        </w:rPr>
+        <w:t>— Olha, garoto… se você mal consegue prestar atenção nas minhas aulas, acha mesmo que vai conseguir criar algo parecido com o que ele fez? Seja realista.</w:t>
+      </w:r>
+    </w:p>
+    <w:p>
+      <w:pPr>
+        <w:spacing w:before="100" w:beforeAutospacing="1" w:after="100" w:afterAutospacing="1" w:line="240" w:lineRule="auto"/>
+        <w:rPr>
+          <w:rFonts w:ascii="Georgia" w:eastAsia="Times New Roman" w:hAnsi="Georgia" w:cs="Times New Roman"/>
+          <w:sz w:val="22"/>
+          <w:szCs w:val="22"/>
+        </w:rPr>
+      </w:pPr>
+      <w:r>
+        <w:rPr>
+          <w:rFonts w:ascii="Georgia" w:eastAsia="Times New Roman" w:hAnsi="Georgia" w:cs="Times New Roman"/>
+          <w:sz w:val="22"/>
+          <w:szCs w:val="22"/>
+        </w:rPr>
+        <w:t>Naquele momento, algo acendeu dentro de Adriel. Uma mistura de raiva e determinação. Ele olhou fixo nos olhos do professor e disse:</w:t>
+      </w:r>
+    </w:p>
+    <w:p>
+      <w:pPr>
+        <w:pStyle w:val="NormalWeb"/>
+        <w:jc w:val="right"/>
+        <w:rPr>
+          <w:rFonts w:ascii="Brush Script MT" w:hAnsi="Brush Script MT"/>
+          <w:b/>
+          <w:bCs/>
+          <w:sz w:val="32"/>
+          <w:szCs w:val="32"/>
+        </w:rPr>
+      </w:pPr>
+      <w:r>
+        <w:rPr>
+          <w:rFonts w:ascii="Brush Script MT" w:hAnsi="Brush Script MT"/>
+          <w:b/>
+          <w:bCs/>
+          <w:sz w:val="32"/>
+          <w:szCs w:val="32"/>
+        </w:rPr>
+        <w:lastRenderedPageBreak/>
+        <w:t>06</w:t>
+      </w:r>
+    </w:p>
+    <w:p>
+      <w:pPr>
+        <w:spacing w:before="100" w:beforeAutospacing="1" w:after="100" w:afterAutospacing="1" w:line="240" w:lineRule="auto"/>
+        <w:rPr>
+          <w:rFonts w:ascii="Georgia" w:eastAsia="Times New Roman" w:hAnsi="Georgia" w:cs="Times New Roman"/>
+          <w:sz w:val="22"/>
+          <w:szCs w:val="22"/>
+        </w:rPr>
+      </w:pPr>
+      <w:r>
+        <w:rPr>
+          <w:rFonts w:ascii="Georgia" w:eastAsia="Times New Roman" w:hAnsi="Georgia" w:cs="Times New Roman"/>
+          <w:sz w:val="22"/>
+          <w:szCs w:val="22"/>
+        </w:rPr>
+        <w:t>— Aposto quanto que, em poucos meses, eu vou conseguir explicar isso pro senhor melhor do que o senhor explica pra gente?</w:t>
+      </w:r>
+    </w:p>
+    <w:p>
+      <w:pPr>
+        <w:spacing w:before="100" w:beforeAutospacing="1" w:after="100" w:afterAutospacing="1" w:line="240" w:lineRule="auto"/>
+        <w:rPr>
+          <w:rFonts w:ascii="Georgia" w:eastAsia="Times New Roman" w:hAnsi="Georgia" w:cs="Times New Roman"/>
+          <w:sz w:val="22"/>
+          <w:szCs w:val="22"/>
+        </w:rPr>
+      </w:pPr>
+      <w:r>
+        <w:rPr>
+          <w:rFonts w:ascii="Georgia" w:eastAsia="Times New Roman" w:hAnsi="Georgia" w:cs="Times New Roman"/>
+          <w:sz w:val="22"/>
+          <w:szCs w:val="22"/>
+        </w:rPr>
+        <w:t>O professor parou de rir. Olhou para Adriel como se estivesse vendo outra pessoa.</w:t>
+      </w:r>
+    </w:p>
+    <w:p>
+      <w:pPr>
+        <w:spacing w:before="100" w:beforeAutospacing="1" w:after="100" w:afterAutospacing="1" w:line="240" w:lineRule="auto"/>
+        <w:rPr>
+          <w:rFonts w:ascii="Georgia" w:eastAsia="Times New Roman" w:hAnsi="Georgia" w:cs="Times New Roman"/>
+          <w:sz w:val="22"/>
+          <w:szCs w:val="22"/>
+        </w:rPr>
+      </w:pPr>
+      <w:r>
+        <w:rPr>
+          <w:rFonts w:ascii="Georgia" w:eastAsia="Times New Roman" w:hAnsi="Georgia" w:cs="Times New Roman"/>
+          <w:sz w:val="22"/>
+          <w:szCs w:val="22"/>
+        </w:rPr>
+        <w:t xml:space="preserve">— Dez por cento do meu salário. Se você conseguir, eu pago </w:t>
+      </w:r>
+      <w:r>
+        <w:rPr>
+          <w:rFonts w:ascii="Georgia" w:eastAsia="Times New Roman" w:hAnsi="Georgia" w:cs="Times New Roman"/>
+          <w:sz w:val="22"/>
+          <w:szCs w:val="22"/>
+        </w:rPr>
+        <w:t xml:space="preserve">feliz </w:t>
+      </w:r>
+      <w:r>
+        <w:rPr>
+          <w:rFonts w:ascii="Georgia" w:eastAsia="Times New Roman" w:hAnsi="Georgia" w:cs="Times New Roman"/>
+          <w:sz w:val="22"/>
+          <w:szCs w:val="22"/>
+        </w:rPr>
+        <w:t>— disse ele, estendendo a mão com um sorriso desafiador. — Mas vou te falar uma coisa: vai ser o dinheiro mais fácil que eu já ganhei na vida.</w:t>
+      </w:r>
+    </w:p>
+    <w:p>
+      <w:pPr>
+        <w:spacing w:before="100" w:beforeAutospacing="1" w:after="100" w:afterAutospacing="1" w:line="240" w:lineRule="auto"/>
+        <w:rPr>
+          <w:rFonts w:ascii="Georgia" w:eastAsia="Times New Roman" w:hAnsi="Georgia" w:cs="Times New Roman"/>
+          <w:sz w:val="22"/>
+          <w:szCs w:val="22"/>
+        </w:rPr>
+      </w:pPr>
+      <w:r>
+        <w:rPr>
+          <w:rFonts w:ascii="Georgia" w:eastAsia="Times New Roman" w:hAnsi="Georgia" w:cs="Times New Roman"/>
+          <w:sz w:val="22"/>
+          <w:szCs w:val="22"/>
+        </w:rPr>
+        <w:t>Adriel apertou a mão dele com força, o olhar firme.</w:t>
+      </w:r>
+    </w:p>
+    <w:p>
+      <w:pPr>
+        <w:spacing w:before="100" w:beforeAutospacing="1" w:after="100" w:afterAutospacing="1" w:line="240" w:lineRule="auto"/>
+        <w:rPr>
+          <w:rFonts w:ascii="Georgia" w:eastAsia="Times New Roman" w:hAnsi="Georgia" w:cs="Times New Roman"/>
+          <w:sz w:val="22"/>
+          <w:szCs w:val="22"/>
+        </w:rPr>
+      </w:pPr>
+      <w:r>
+        <w:rPr>
+          <w:rFonts w:ascii="Georgia" w:eastAsia="Times New Roman" w:hAnsi="Georgia" w:cs="Times New Roman"/>
+          <w:sz w:val="22"/>
+          <w:szCs w:val="22"/>
+        </w:rPr>
+        <w:t>— Então tá apostado.</w:t>
+      </w:r>
+    </w:p>
+    <w:p>
+      <w:pPr>
+        <w:spacing w:before="100" w:beforeAutospacing="1" w:after="100" w:afterAutospacing="1" w:line="240" w:lineRule="auto"/>
+        <w:rPr>
+          <w:rFonts w:ascii="Georgia" w:eastAsia="Times New Roman" w:hAnsi="Georgia" w:cs="Times New Roman"/>
+          <w:sz w:val="22"/>
+          <w:szCs w:val="22"/>
+        </w:rPr>
+      </w:pPr>
+      <w:r>
+        <w:rPr>
+          <w:rFonts w:ascii="Georgia" w:eastAsia="Times New Roman" w:hAnsi="Georgia" w:cs="Times New Roman"/>
+          <w:sz w:val="22"/>
+          <w:szCs w:val="22"/>
+        </w:rPr>
+        <w:t>Enquanto voltava para casa andando devagar, Adriel sentia uma chama queimando no peito. Pela primeira vez em muito tempo, ele não estava apenas sonhando.</w:t>
+      </w:r>
+    </w:p>
+    <w:p>
+      <w:pPr>
+        <w:spacing w:before="100" w:beforeAutospacing="1" w:after="100" w:afterAutospacing="1" w:line="240" w:lineRule="auto"/>
+        <w:rPr>
+          <w:rFonts w:ascii="Times New Roman" w:eastAsia="Times New Roman" w:hAnsi="Times New Roman" w:cs="Times New Roman"/>
+        </w:rPr>
+      </w:pPr>
+      <w:r>
+        <w:rPr>
+          <w:rFonts w:ascii="Times New Roman" w:eastAsia="Times New Roman" w:hAnsi="Times New Roman" w:cs="Times New Roman"/>
+        </w:rPr>
+        <w:t xml:space="preserve">Ele tinha um </w:t>
+      </w:r>
+      <w:r>
+        <w:rPr>
+          <w:rFonts w:ascii="Times New Roman" w:eastAsia="Times New Roman" w:hAnsi="Times New Roman" w:cs="Times New Roman"/>
+        </w:rPr>
+        <w:t>desafio</w:t>
+      </w:r>
+      <w:r>
+        <w:rPr>
+          <w:rFonts w:ascii="Times New Roman" w:eastAsia="Times New Roman" w:hAnsi="Times New Roman" w:cs="Times New Roman"/>
+        </w:rPr>
+        <w:t xml:space="preserve"> de verdade.</w:t>
+      </w:r>
+    </w:p>
+    <w:p>
+      <w:pPr>
+        <w:pStyle w:val="NormalWeb"/>
+        <w:ind w:left="142"/>
+        <w:rPr>
           <w:rFonts w:ascii="Liberation Mono" w:hAnsi="Liberation Mono" w:cs="Liberation Mono"/>
           <w:sz w:val="28"/>
           <w:szCs w:val="28"/>
         </w:rPr>
       </w:pPr>
-      <w:r>
-        <w:rPr>
-          <w:rFonts w:ascii="Liberation Mono" w:hAnsi="Liberation Mono" w:cs="Liberation Mono"/>
-          <w:sz w:val="48"/>
-          <w:szCs w:val="48"/>
-        </w:rPr>
-        <w:t>A</w:t>
-      </w:r>
-      <w:r>
-        <w:rPr>
-          <w:rFonts w:ascii="Liberation Mono" w:hAnsi="Liberation Mono" w:cs="Liberation Mono"/>
-          <w:sz w:val="28"/>
-          <w:szCs w:val="28"/>
-        </w:rPr>
-        <w:t xml:space="preserve"> chama</w:t>
-      </w:r>
     </w:p>
     <w:p>
       <w:pPr>
@@ -805,7 +1592,7 @@
       <w:lvlText w:val=""/>
       <w:lvlJc w:val="left"/>
       <w:pPr>
-        <w:ind w:left="720" w:hanging="360"/>
+        <w:ind w:left="4972" w:hanging="360"/>
       </w:pPr>
       <w:rPr>
         <w:rFonts w:ascii="Symbol" w:hAnsi="Symbol" w:hint="default"/>
@@ -817,7 +1604,7 @@
       <w:lvlText w:val="o"/>
       <w:lvlJc w:val="left"/>
       <w:pPr>
-        <w:ind w:left="1440" w:hanging="360"/>
+        <w:ind w:left="5692" w:hanging="360"/>
       </w:pPr>
       <w:rPr>
         <w:rFonts w:ascii="Courier New" w:hAnsi="Courier New" w:cs="Courier New" w:hint="default"/>
@@ -829,7 +1616,7 @@
       <w:lvlText w:val=""/>
       <w:lvlJc w:val="left"/>
       <w:pPr>
-        <w:ind w:left="2160" w:hanging="360"/>
+        <w:ind w:left="6412" w:hanging="360"/>
       </w:pPr>
       <w:rPr>
         <w:rFonts w:ascii="Wingdings" w:hAnsi="Wingdings" w:hint="default"/>
@@ -841,7 +1628,7 @@
       <w:lvlText w:val=""/>
       <w:lvlJc w:val="left"/>
       <w:pPr>
-        <w:ind w:left="2880" w:hanging="360"/>
+        <w:ind w:left="7132" w:hanging="360"/>
       </w:pPr>
       <w:rPr>
         <w:rFonts w:ascii="Symbol" w:hAnsi="Symbol" w:hint="default"/>
@@ -853,7 +1640,7 @@
       <w:lvlText w:val="o"/>
       <w:lvlJc w:val="left"/>
       <w:pPr>
-        <w:ind w:left="3600" w:hanging="360"/>
+        <w:ind w:left="7852" w:hanging="360"/>
       </w:pPr>
       <w:rPr>
         <w:rFonts w:ascii="Courier New" w:hAnsi="Courier New" w:cs="Courier New" w:hint="default"/>
@@ -865,7 +1652,7 @@
       <w:lvlText w:val=""/>
       <w:lvlJc w:val="left"/>
       <w:pPr>
-        <w:ind w:left="4320" w:hanging="360"/>
+        <w:ind w:left="8572" w:hanging="360"/>
       </w:pPr>
       <w:rPr>
         <w:rFonts w:ascii="Wingdings" w:hAnsi="Wingdings" w:hint="default"/>
@@ -877,7 +1664,7 @@
       <w:lvlText w:val=""/>
       <w:lvlJc w:val="left"/>
       <w:pPr>
-        <w:ind w:left="5040" w:hanging="360"/>
+        <w:ind w:left="9292" w:hanging="360"/>
       </w:pPr>
       <w:rPr>
         <w:rFonts w:ascii="Symbol" w:hAnsi="Symbol" w:hint="default"/>
@@ -889,7 +1676,7 @@
       <w:lvlText w:val="o"/>
       <w:lvlJc w:val="left"/>
       <w:pPr>
-        <w:ind w:left="5760" w:hanging="360"/>
+        <w:ind w:left="10012" w:hanging="360"/>
       </w:pPr>
       <w:rPr>
         <w:rFonts w:ascii="Courier New" w:hAnsi="Courier New" w:cs="Courier New" w:hint="default"/>
@@ -901,7 +1688,7 @@
       <w:lvlText w:val=""/>
       <w:lvlJc w:val="left"/>
       <w:pPr>
-        <w:ind w:left="6480" w:hanging="360"/>
+        <w:ind w:left="10732" w:hanging="360"/>
       </w:pPr>
       <w:rPr>
         <w:rFonts w:ascii="Wingdings" w:hAnsi="Wingdings" w:hint="default"/>
@@ -1024,17 +1811,17 @@
   <w:abstractNum w:abstractNumId="2" w15:restartNumberingAfterBreak="0">
     <w:nsid w:val="54F2173F"/>
     <w:multiLevelType w:val="hybridMultilevel"/>
-    <w:tmpl w:val="1186B0E8"/>
-    <w:lvl w:ilvl="0" w:tplc="04160001">
+    <w:tmpl w:val="B21A1CDA"/>
+    <w:lvl w:ilvl="0" w:tplc="04160005">
       <w:start w:val="1"/>
       <w:numFmt w:val="bullet"/>
-      <w:lvlText w:val=""/>
+      <w:lvlText w:val=""/>
       <w:lvlJc w:val="left"/>
       <w:pPr>
         <w:ind w:left="502" w:hanging="360"/>
       </w:pPr>
       <w:rPr>
-        <w:rFonts w:ascii="Symbol" w:hAnsi="Symbol" w:hint="default"/>
+        <w:rFonts w:ascii="Wingdings" w:hAnsi="Wingdings" w:hint="default"/>
       </w:rPr>
     </w:lvl>
     <w:lvl w:ilvl="1" w:tplc="04160003" w:tentative="1">
@@ -1544,6 +2331,7 @@
   <w:style w:type="paragraph" w:default="1" w:styleId="Normal">
     <w:name w:val="Normal"/>
     <w:qFormat/>
+    <w:rsid w:val="00605F87"/>
   </w:style>
   <w:style w:type="paragraph" w:styleId="Ttulo1">
     <w:name w:val="heading 1"/>
@@ -1766,6 +2554,17 @@
       <w:sz w:val="48"/>
       <w:szCs w:val="48"/>
     </w:rPr>
+  </w:style>
+  <w:style w:type="paragraph" w:styleId="PargrafodaLista">
+    <w:name w:val="List Paragraph"/>
+    <w:basedOn w:val="Normal"/>
+    <w:uiPriority w:val="34"/>
+    <w:qFormat/>
+    <w:rsid w:val="00B9286C"/>
+    <w:pPr>
+      <w:ind w:left="720"/>
+      <w:contextualSpacing/>
+    </w:pPr>
   </w:style>
 </w:styles>
 </file>

</xml_diff>

<commit_message>
feat: adiciona o subtópico "O desafio"
</commit_message>
<xml_diff>
--- a/vol-1/Além_do_Código-Livro_principal.docx
+++ b/vol-1/Além_do_Código-Livro_principal.docx
@@ -322,7 +322,13 @@
         <w:rPr>
           <w:rFonts w:ascii="Georgia" w:eastAsia="Times New Roman" w:hAnsi="Georgia" w:cs="Times New Roman"/>
         </w:rPr>
-        <w:t>Capítulo 2 – O Preço de um Sonho .................................... 12</w:t>
+        <w:t xml:space="preserve">Capítulo 2 – O Preço de um Sonho .................................... </w:t>
+      </w:r>
+      <w:r>
+        <w:rPr>
+          <w:rFonts w:ascii="Georgia" w:eastAsia="Times New Roman" w:hAnsi="Georgia" w:cs="Times New Roman"/>
+        </w:rPr>
+        <w:t>09</w:t>
       </w:r>
     </w:p>
     <w:p>
@@ -823,18 +829,26 @@
     <w:p>
       <w:pPr>
         <w:pStyle w:val="NormalWeb"/>
-        <w:numPr>
-          <w:ilvl w:val="0"/>
-          <w:numId w:val="3"/>
-        </w:numPr>
+        <w:rPr>
+          <w:rFonts w:ascii="Georgia" w:hAnsi="Georgia"/>
+          <w:sz w:val="22"/>
+          <w:szCs w:val="22"/>
+        </w:rPr>
+      </w:pPr>
+    </w:p>
+    <w:p>
+      <w:pPr>
+        <w:pStyle w:val="NormalWeb"/>
+        <w:ind w:left="142"/>
+        <w:jc w:val="center"/>
         <w:rPr>
           <w:rFonts w:ascii="Garamond" w:hAnsi="Garamond" w:cs="Liberation Mono"/>
           <w:b/>
           <w:bCs/>
           <w:i/>
           <w:iCs/>
-          <w:sz w:val="30"/>
-          <w:szCs w:val="30"/>
+          <w:sz w:val="32"/>
+          <w:szCs w:val="32"/>
         </w:rPr>
       </w:pPr>
       <w:r>
@@ -844,8 +858,8 @@
           <w:bCs/>
           <w:i/>
           <w:iCs/>
-          <w:sz w:val="30"/>
-          <w:szCs w:val="30"/>
+          <w:sz w:val="32"/>
+          <w:szCs w:val="32"/>
         </w:rPr>
         <w:t>A chama</w:t>
       </w:r>
@@ -1099,7 +1113,6 @@
           <w:sz w:val="32"/>
           <w:szCs w:val="32"/>
         </w:rPr>
-        <w:lastRenderedPageBreak/>
         <w:t xml:space="preserve">      </w:t>
       </w:r>
       <w:r>
@@ -1366,14 +1379,6 @@
           <w:szCs w:val="22"/>
         </w:rPr>
       </w:pPr>
-      <w:r>
-        <w:rPr>
-          <w:rFonts w:ascii="Georgia" w:eastAsia="Times New Roman" w:hAnsi="Georgia" w:cs="Times New Roman"/>
-          <w:sz w:val="22"/>
-          <w:szCs w:val="22"/>
-        </w:rPr>
-        <w:t>Naquele momento, algo acendeu dentro de Adriel. Uma mistura de raiva e determinação. Ele olhou fixo nos olhos do professor e disse:</w:t>
-      </w:r>
     </w:p>
     <w:p>
       <w:pPr>
@@ -1414,6 +1419,24 @@
           <w:sz w:val="22"/>
           <w:szCs w:val="22"/>
         </w:rPr>
+        <w:t>Naquele momento, algo acendeu dentro de Adriel. Uma mistura de raiva e determinação. Ele olhou fixo nos olhos do professor e disse:</w:t>
+      </w:r>
+    </w:p>
+    <w:p>
+      <w:pPr>
+        <w:spacing w:before="100" w:beforeAutospacing="1" w:after="100" w:afterAutospacing="1" w:line="240" w:lineRule="auto"/>
+        <w:rPr>
+          <w:rFonts w:ascii="Georgia" w:eastAsia="Times New Roman" w:hAnsi="Georgia" w:cs="Times New Roman"/>
+          <w:sz w:val="22"/>
+          <w:szCs w:val="22"/>
+        </w:rPr>
+      </w:pPr>
+      <w:r>
+        <w:rPr>
+          <w:rFonts w:ascii="Georgia" w:eastAsia="Times New Roman" w:hAnsi="Georgia" w:cs="Times New Roman"/>
+          <w:sz w:val="22"/>
+          <w:szCs w:val="22"/>
+        </w:rPr>
         <w:t>— Aposto quanto que, em poucos meses, eu vou conseguir explicar isso pro senhor melhor do que o senhor explica pra gente?</w:t>
       </w:r>
     </w:p>
@@ -1548,6 +1571,389 @@
         </w:rPr>
         <w:t xml:space="preserve"> de verdade.</w:t>
       </w:r>
+    </w:p>
+    <w:p>
+      <w:pPr>
+        <w:spacing w:before="100" w:beforeAutospacing="1" w:after="100" w:afterAutospacing="1" w:line="240" w:lineRule="auto"/>
+        <w:rPr>
+          <w:rFonts w:ascii="Times New Roman" w:eastAsia="Times New Roman" w:hAnsi="Times New Roman" w:cs="Times New Roman"/>
+        </w:rPr>
+      </w:pPr>
+    </w:p>
+    <w:p>
+      <w:pPr>
+        <w:spacing w:before="100" w:beforeAutospacing="1" w:after="100" w:afterAutospacing="1" w:line="240" w:lineRule="auto"/>
+        <w:jc w:val="center"/>
+        <w:rPr>
+          <w:rFonts w:ascii="Garamond" w:eastAsia="Times New Roman" w:hAnsi="Garamond" w:cs="Times New Roman"/>
+          <w:i/>
+          <w:iCs/>
+          <w:sz w:val="32"/>
+          <w:szCs w:val="32"/>
+        </w:rPr>
+      </w:pPr>
+      <w:r>
+        <w:rPr>
+          <w:rFonts w:ascii="Garamond" w:eastAsia="Times New Roman" w:hAnsi="Garamond" w:cs="Times New Roman"/>
+          <w:b/>
+          <w:bCs/>
+          <w:i/>
+          <w:iCs/>
+          <w:sz w:val="32"/>
+          <w:szCs w:val="32"/>
+        </w:rPr>
+        <w:t>O Desafio</w:t>
+      </w:r>
+    </w:p>
+    <w:p>
+      <w:pPr>
+        <w:spacing w:before="100" w:beforeAutospacing="1" w:after="100" w:afterAutospacing="1" w:line="240" w:lineRule="auto"/>
+        <w:rPr>
+          <w:rFonts w:ascii="Times New Roman" w:eastAsia="Times New Roman" w:hAnsi="Times New Roman" w:cs="Times New Roman"/>
+        </w:rPr>
+      </w:pPr>
+      <w:r>
+        <w:rPr>
+          <w:rFonts w:ascii="Times New Roman" w:eastAsia="Times New Roman" w:hAnsi="Times New Roman" w:cs="Times New Roman"/>
+        </w:rPr>
+        <w:t>Chegando em casa, Adriel jogou a mochila no canto da sala e se jogou no mesmo sofá onde tudo havia começado na tarde anterior. O ventilador velho girava preguiçosamente no teto, mas não conseguia afastar o calor que subia do chão.</w:t>
+      </w:r>
+    </w:p>
+    <w:p>
+      <w:pPr>
+        <w:spacing w:before="100" w:beforeAutospacing="1" w:after="100" w:afterAutospacing="1" w:line="240" w:lineRule="auto"/>
+        <w:rPr>
+          <w:rFonts w:ascii="Times New Roman" w:eastAsia="Times New Roman" w:hAnsi="Times New Roman" w:cs="Times New Roman"/>
+        </w:rPr>
+      </w:pPr>
+      <w:r>
+        <w:rPr>
+          <w:rFonts w:ascii="Times New Roman" w:eastAsia="Times New Roman" w:hAnsi="Times New Roman" w:cs="Times New Roman"/>
+        </w:rPr>
+        <w:t>Sua mãe estava na cozinha, costurando mais uma encomenda. O pai ainda não havia chegado — provavelmente tinha ficado até mais tarde na obra para tentar ganhar um pouco mais.</w:t>
+      </w:r>
+    </w:p>
+    <w:p>
+      <w:pPr>
+        <w:pStyle w:val="NormalWeb"/>
+        <w:jc w:val="right"/>
+        <w:rPr>
+          <w:rFonts w:ascii="Brush Script MT" w:hAnsi="Brush Script MT"/>
+          <w:b/>
+          <w:bCs/>
+          <w:sz w:val="32"/>
+          <w:szCs w:val="32"/>
+        </w:rPr>
+      </w:pPr>
+      <w:r>
+        <w:rPr>
+          <w:rFonts w:ascii="Brush Script MT" w:hAnsi="Brush Script MT"/>
+          <w:b/>
+          <w:bCs/>
+          <w:sz w:val="32"/>
+          <w:szCs w:val="32"/>
+        </w:rPr>
+        <w:lastRenderedPageBreak/>
+        <w:t>07</w:t>
+      </w:r>
+    </w:p>
+    <w:p>
+      <w:pPr>
+        <w:spacing w:before="100" w:beforeAutospacing="1" w:after="100" w:afterAutospacing="1" w:line="240" w:lineRule="auto"/>
+        <w:rPr>
+          <w:rFonts w:ascii="Times New Roman" w:eastAsia="Times New Roman" w:hAnsi="Times New Roman" w:cs="Times New Roman"/>
+        </w:rPr>
+      </w:pPr>
+      <w:r>
+        <w:rPr>
+          <w:rFonts w:ascii="Times New Roman" w:eastAsia="Times New Roman" w:hAnsi="Times New Roman" w:cs="Times New Roman"/>
+        </w:rPr>
+        <w:t xml:space="preserve">Adriel ficou olhando para o teto rachado, a mente trabalhando rápido. Dez por cento do salário do professor Oliveira. Era muito dinheiro. Dinheiro que poderia ajudar a pagar uma parcela da dívida do pai, ou pelo menos comprar um celular melhor. Mas, </w:t>
+      </w:r>
+    </w:p>
+    <w:p>
+      <w:pPr>
+        <w:spacing w:before="100" w:beforeAutospacing="1" w:after="100" w:afterAutospacing="1" w:line="240" w:lineRule="auto"/>
+        <w:rPr>
+          <w:rFonts w:ascii="Times New Roman" w:eastAsia="Times New Roman" w:hAnsi="Times New Roman" w:cs="Times New Roman"/>
+        </w:rPr>
+      </w:pPr>
+      <w:r>
+        <w:rPr>
+          <w:rFonts w:ascii="Times New Roman" w:eastAsia="Times New Roman" w:hAnsi="Times New Roman" w:cs="Times New Roman"/>
+        </w:rPr>
+        <w:t>mais do que isso, era a chance de provar que ele não era só “aquele menino bagunceiro” que todo mundo via.</w:t>
+      </w:r>
+    </w:p>
+    <w:p>
+      <w:pPr>
+        <w:spacing w:before="100" w:beforeAutospacing="1" w:after="100" w:afterAutospacing="1" w:line="240" w:lineRule="auto"/>
+        <w:rPr>
+          <w:rFonts w:ascii="Times New Roman" w:eastAsia="Times New Roman" w:hAnsi="Times New Roman" w:cs="Times New Roman"/>
+        </w:rPr>
+      </w:pPr>
+      <w:r>
+        <w:rPr>
+          <w:rFonts w:ascii="Times New Roman" w:eastAsia="Times New Roman" w:hAnsi="Times New Roman" w:cs="Times New Roman"/>
+        </w:rPr>
+        <w:t>— Chegou cedo hoje — disse Edna, aparecendo na porta da cozinha com as mãos cheias de linha.</w:t>
+      </w:r>
+    </w:p>
+    <w:p>
+      <w:pPr>
+        <w:spacing w:before="100" w:beforeAutospacing="1" w:after="100" w:afterAutospacing="1" w:line="240" w:lineRule="auto"/>
+        <w:rPr>
+          <w:rFonts w:ascii="Times New Roman" w:eastAsia="Times New Roman" w:hAnsi="Times New Roman" w:cs="Times New Roman"/>
+        </w:rPr>
+      </w:pPr>
+      <w:r>
+        <w:rPr>
+          <w:rFonts w:ascii="Times New Roman" w:eastAsia="Times New Roman" w:hAnsi="Times New Roman" w:cs="Times New Roman"/>
+        </w:rPr>
+        <w:t>— É... — respondeu Adriel, distraído.</w:t>
+      </w:r>
+    </w:p>
+    <w:p>
+      <w:pPr>
+        <w:spacing w:before="100" w:beforeAutospacing="1" w:after="100" w:afterAutospacing="1" w:line="240" w:lineRule="auto"/>
+        <w:rPr>
+          <w:rFonts w:ascii="Times New Roman" w:eastAsia="Times New Roman" w:hAnsi="Times New Roman" w:cs="Times New Roman"/>
+        </w:rPr>
+      </w:pPr>
+      <w:r>
+        <w:rPr>
+          <w:rFonts w:ascii="Times New Roman" w:eastAsia="Times New Roman" w:hAnsi="Times New Roman" w:cs="Times New Roman"/>
+        </w:rPr>
+        <w:t>Ele hesitou por um segundo, mas acabou contando:</w:t>
+      </w:r>
+    </w:p>
+    <w:p>
+      <w:pPr>
+        <w:spacing w:before="100" w:beforeAutospacing="1" w:after="100" w:afterAutospacing="1" w:line="240" w:lineRule="auto"/>
+        <w:rPr>
+          <w:rFonts w:ascii="Times New Roman" w:eastAsia="Times New Roman" w:hAnsi="Times New Roman" w:cs="Times New Roman"/>
+        </w:rPr>
+      </w:pPr>
+      <w:r>
+        <w:rPr>
+          <w:rFonts w:ascii="Times New Roman" w:eastAsia="Times New Roman" w:hAnsi="Times New Roman" w:cs="Times New Roman"/>
+        </w:rPr>
+        <w:t>— Mãe, hoje eu fiz uma aposta com o professor de Informática.</w:t>
+      </w:r>
+    </w:p>
+    <w:p>
+      <w:pPr>
+        <w:spacing w:before="100" w:beforeAutospacing="1" w:after="100" w:afterAutospacing="1" w:line="240" w:lineRule="auto"/>
+        <w:rPr>
+          <w:rFonts w:ascii="Times New Roman" w:eastAsia="Times New Roman" w:hAnsi="Times New Roman" w:cs="Times New Roman"/>
+        </w:rPr>
+      </w:pPr>
+      <w:r>
+        <w:rPr>
+          <w:rFonts w:ascii="Times New Roman" w:eastAsia="Times New Roman" w:hAnsi="Times New Roman" w:cs="Times New Roman"/>
+        </w:rPr>
+        <w:t>Edna ergueu uma sobrancelha.</w:t>
+      </w:r>
+    </w:p>
+    <w:p>
+      <w:pPr>
+        <w:spacing w:before="100" w:beforeAutospacing="1" w:after="100" w:afterAutospacing="1" w:line="240" w:lineRule="auto"/>
+        <w:rPr>
+          <w:rFonts w:ascii="Times New Roman" w:eastAsia="Times New Roman" w:hAnsi="Times New Roman" w:cs="Times New Roman"/>
+        </w:rPr>
+      </w:pPr>
+      <w:r>
+        <w:rPr>
+          <w:rFonts w:ascii="Times New Roman" w:eastAsia="Times New Roman" w:hAnsi="Times New Roman" w:cs="Times New Roman"/>
+        </w:rPr>
+        <w:t>— Aposta? Que tipo de aposta, Adriel?</w:t>
+      </w:r>
+    </w:p>
+    <w:p>
+      <w:pPr>
+        <w:spacing w:before="100" w:beforeAutospacing="1" w:after="100" w:afterAutospacing="1" w:line="240" w:lineRule="auto"/>
+        <w:rPr>
+          <w:rFonts w:ascii="Times New Roman" w:eastAsia="Times New Roman" w:hAnsi="Times New Roman" w:cs="Times New Roman"/>
+        </w:rPr>
+      </w:pPr>
+      <w:r>
+        <w:rPr>
+          <w:rFonts w:ascii="Times New Roman" w:eastAsia="Times New Roman" w:hAnsi="Times New Roman" w:cs="Times New Roman"/>
+        </w:rPr>
+        <w:t>— Que em poucos meses eu vou conseguir explicar programação melhor que ele.</w:t>
+      </w:r>
+    </w:p>
+    <w:p>
+      <w:pPr>
+        <w:spacing w:before="100" w:beforeAutospacing="1" w:after="100" w:afterAutospacing="1" w:line="240" w:lineRule="auto"/>
+        <w:rPr>
+          <w:rFonts w:ascii="Times New Roman" w:eastAsia="Times New Roman" w:hAnsi="Times New Roman" w:cs="Times New Roman"/>
+        </w:rPr>
+      </w:pPr>
+      <w:r>
+        <w:rPr>
+          <w:rFonts w:ascii="Times New Roman" w:eastAsia="Times New Roman" w:hAnsi="Times New Roman" w:cs="Times New Roman"/>
+        </w:rPr>
+        <w:t>A mãe soltou um suspiro longo, daqueles que misturavam cansaço e preocupação.</w:t>
+      </w:r>
+    </w:p>
+    <w:p>
+      <w:pPr>
+        <w:spacing w:before="100" w:beforeAutospacing="1" w:after="100" w:afterAutospacing="1" w:line="240" w:lineRule="auto"/>
+        <w:rPr>
+          <w:rFonts w:ascii="Times New Roman" w:eastAsia="Times New Roman" w:hAnsi="Times New Roman" w:cs="Times New Roman"/>
+        </w:rPr>
+      </w:pPr>
+      <w:r>
+        <w:rPr>
+          <w:rFonts w:ascii="Times New Roman" w:eastAsia="Times New Roman" w:hAnsi="Times New Roman" w:cs="Times New Roman"/>
+        </w:rPr>
+        <w:t>— Filho... não começa com essas coisas. Você mal consegue prestar atenção na aula normal. Agora quer aprender programação? Com o que? Com a força do pensamento?</w:t>
+      </w:r>
+    </w:p>
+    <w:p>
+      <w:pPr>
+        <w:spacing w:before="100" w:beforeAutospacing="1" w:after="100" w:afterAutospacing="1" w:line="240" w:lineRule="auto"/>
+        <w:rPr>
+          <w:rFonts w:ascii="Times New Roman" w:eastAsia="Times New Roman" w:hAnsi="Times New Roman" w:cs="Times New Roman"/>
+        </w:rPr>
+      </w:pPr>
+      <w:r>
+        <w:rPr>
+          <w:rFonts w:ascii="Times New Roman" w:eastAsia="Times New Roman" w:hAnsi="Times New Roman" w:cs="Times New Roman"/>
+        </w:rPr>
+        <w:t>Adriel sentou-se no sofá, mais ereto.</w:t>
+      </w:r>
+    </w:p>
+    <w:p>
+      <w:pPr>
+        <w:spacing w:before="100" w:beforeAutospacing="1" w:after="100" w:afterAutospacing="1" w:line="240" w:lineRule="auto"/>
+        <w:rPr>
+          <w:rFonts w:ascii="Times New Roman" w:eastAsia="Times New Roman" w:hAnsi="Times New Roman" w:cs="Times New Roman"/>
+        </w:rPr>
+      </w:pPr>
+      <w:r>
+        <w:rPr>
+          <w:rFonts w:ascii="Times New Roman" w:eastAsia="Times New Roman" w:hAnsi="Times New Roman" w:cs="Times New Roman"/>
+        </w:rPr>
+        <w:t>— Eu vou dar um jeito. Vou aprender sozinho. No YouTube, no celular... sei lá. Mas eu vou aprender.</w:t>
+      </w:r>
+    </w:p>
+    <w:p>
+      <w:pPr>
+        <w:pStyle w:val="NormalWeb"/>
+        <w:jc w:val="right"/>
+        <w:rPr>
+          <w:rFonts w:ascii="Brush Script MT" w:hAnsi="Brush Script MT"/>
+          <w:b/>
+          <w:bCs/>
+          <w:sz w:val="32"/>
+          <w:szCs w:val="32"/>
+        </w:rPr>
+      </w:pPr>
+      <w:r>
+        <w:rPr>
+          <w:rFonts w:ascii="Brush Script MT" w:hAnsi="Brush Script MT"/>
+          <w:b/>
+          <w:bCs/>
+          <w:sz w:val="32"/>
+          <w:szCs w:val="32"/>
+        </w:rPr>
+        <w:lastRenderedPageBreak/>
+        <w:t>08</w:t>
+      </w:r>
+    </w:p>
+    <w:p>
+      <w:pPr>
+        <w:spacing w:before="100" w:beforeAutospacing="1" w:after="100" w:afterAutospacing="1" w:line="240" w:lineRule="auto"/>
+        <w:rPr>
+          <w:rFonts w:ascii="Times New Roman" w:eastAsia="Times New Roman" w:hAnsi="Times New Roman" w:cs="Times New Roman"/>
+        </w:rPr>
+      </w:pPr>
+      <w:r>
+        <w:rPr>
+          <w:rFonts w:ascii="Times New Roman" w:eastAsia="Times New Roman" w:hAnsi="Times New Roman" w:cs="Times New Roman"/>
+        </w:rPr>
+        <w:t>Edna ficou quieta por alguns segundos, olhando para o filho. Havia algo diferente no olhar dele hoje. Uma faísca que ela não via há muito tempo.</w:t>
+      </w:r>
+    </w:p>
+    <w:p>
+      <w:pPr>
+        <w:spacing w:before="100" w:beforeAutospacing="1" w:after="100" w:afterAutospacing="1" w:line="240" w:lineRule="auto"/>
+        <w:rPr>
+          <w:rFonts w:ascii="Times New Roman" w:eastAsia="Times New Roman" w:hAnsi="Times New Roman" w:cs="Times New Roman"/>
+        </w:rPr>
+      </w:pPr>
+      <w:r>
+        <w:rPr>
+          <w:rFonts w:ascii="Times New Roman" w:eastAsia="Times New Roman" w:hAnsi="Times New Roman" w:cs="Times New Roman"/>
+        </w:rPr>
+        <w:t>— Só não quero te ver frustrado depois — murmurou ela, voltando para a cozinha. — A vida já é difícil o suficiente.</w:t>
+      </w:r>
+    </w:p>
+    <w:p>
+      <w:pPr>
+        <w:spacing w:before="100" w:beforeAutospacing="1" w:after="100" w:afterAutospacing="1" w:line="240" w:lineRule="auto"/>
+        <w:rPr>
+          <w:rFonts w:ascii="Times New Roman" w:eastAsia="Times New Roman" w:hAnsi="Times New Roman" w:cs="Times New Roman"/>
+        </w:rPr>
+      </w:pPr>
+      <w:r>
+        <w:rPr>
+          <w:rFonts w:ascii="Times New Roman" w:eastAsia="Times New Roman" w:hAnsi="Times New Roman" w:cs="Times New Roman"/>
+        </w:rPr>
+        <w:t>Adriel não respondeu. Ficou ali, olhando para o nada, enquanto o sol terminava de se pôr lá fora.</w:t>
+      </w:r>
+    </w:p>
+    <w:p>
+      <w:pPr>
+        <w:spacing w:before="100" w:beforeAutospacing="1" w:after="100" w:afterAutospacing="1" w:line="240" w:lineRule="auto"/>
+        <w:rPr>
+          <w:rFonts w:ascii="Times New Roman" w:eastAsia="Times New Roman" w:hAnsi="Times New Roman" w:cs="Times New Roman"/>
+        </w:rPr>
+      </w:pPr>
+      <w:r>
+        <w:rPr>
+          <w:rFonts w:ascii="Times New Roman" w:eastAsia="Times New Roman" w:hAnsi="Times New Roman" w:cs="Times New Roman"/>
+        </w:rPr>
+        <w:t>Pela primeira vez, ele não sentia apenas vontade de mudar de vida.</w:t>
+      </w:r>
+    </w:p>
+    <w:p>
+      <w:pPr>
+        <w:spacing w:before="100" w:beforeAutospacing="1" w:after="100" w:afterAutospacing="1" w:line="240" w:lineRule="auto"/>
+        <w:rPr>
+          <w:rFonts w:ascii="Times New Roman" w:eastAsia="Times New Roman" w:hAnsi="Times New Roman" w:cs="Times New Roman"/>
+        </w:rPr>
+      </w:pPr>
+      <w:r>
+        <w:rPr>
+          <w:rFonts w:ascii="Times New Roman" w:eastAsia="Times New Roman" w:hAnsi="Times New Roman" w:cs="Times New Roman"/>
+        </w:rPr>
+        <w:t>Ele sentia que precisava mudar.</w:t>
+      </w:r>
+    </w:p>
+    <w:p>
+      <w:pPr>
+        <w:spacing w:before="100" w:beforeAutospacing="1" w:after="100" w:afterAutospacing="1" w:line="240" w:lineRule="auto"/>
+        <w:rPr>
+          <w:rFonts w:ascii="Times New Roman" w:eastAsia="Times New Roman" w:hAnsi="Times New Roman" w:cs="Times New Roman"/>
+        </w:rPr>
+      </w:pPr>
+      <w:r>
+        <w:rPr>
+          <w:rFonts w:ascii="Times New Roman" w:eastAsia="Times New Roman" w:hAnsi="Times New Roman" w:cs="Times New Roman"/>
+        </w:rPr>
+        <w:t>E aquela aposta, por mais maluca que parecesse, era o primeiro passo.</w:t>
+      </w:r>
+    </w:p>
+    <w:p>
+      <w:pPr>
+        <w:spacing w:before="100" w:beforeAutospacing="1" w:after="100" w:afterAutospacing="1" w:line="240" w:lineRule="auto"/>
+        <w:rPr>
+          <w:rFonts w:ascii="Times New Roman" w:eastAsia="Times New Roman" w:hAnsi="Times New Roman" w:cs="Times New Roman"/>
+        </w:rPr>
+      </w:pPr>
     </w:p>
     <w:p>
       <w:pPr>

</xml_diff>